<commit_message>
changed procedural posture notes template
</commit_message>
<xml_diff>
--- a/notes/lawyering_skills_and_strategies/Memo.docx
+++ b/notes/lawyering_skills_and_strategies/Memo.docx
@@ -31,7 +31,7 @@
       </w:pPr>
       <w:r>
         <w:rPr/>
-        <w:t>A person can reside in one state and be domiciled in another Miss. Band of Choctaw Indians v. Holyfield, 490 U.S. 30 (1989)</w:t>
+        <w:t>A person can reside in one state and be domiciled in another. Miss. Band of Choctaw Indians v. Holyfield, 490 U.S. 30 (1989)</w:t>
       </w:r>
     </w:p>
     <w:p>
@@ -67,11 +67,7 @@
       </w:r>
       <w:r>
         <w:rPr/>
-        <w:t xml:space="preserve">A person's previous domicile is not lost until a new one is acquired”. Von Dunser v. Aronoff, 915 F.2d 1071, 1072 (6th Cir.1990) </w:t>
-      </w:r>
-      <w:r>
-        <w:rPr/>
-        <w:t xml:space="preserve"> </w:t>
+        <w:t xml:space="preserve">A person's previous domicile is not lost until a new one is acquired”. Von Dunser v. Aronoff, 915 F.2d 1071, 1072 (6th Cir.1990)  </w:t>
       </w:r>
     </w:p>
     <w:p>
@@ -91,11 +87,7 @@
       </w:r>
       <w:r>
         <w:rPr/>
-        <w:t xml:space="preserve">Federal jurisdiction is tested according to the facts as they exist at the time an action is initiated” </w:t>
-      </w:r>
-      <w:r>
-        <w:rPr/>
-        <w:t xml:space="preserve">Television Reception Corp. v. Dunbar, 426 F.2d 174, 177 (6th Cir.1970). </w:t>
+        <w:t xml:space="preserve">Federal jurisdiction is tested according to the facts as they exist at the time an action is initiated” Television Reception Corp. v. Dunbar, 426 F.2d 174, 177 (6th Cir.1970). </w:t>
       </w:r>
     </w:p>
     <w:p>
@@ -173,15 +165,7 @@
       </w:pPr>
       <w:r>
         <w:rPr/>
-        <w:t xml:space="preserve">Plaintiff sued 35 Kentucky defendants under </w:t>
-      </w:r>
-      <w:r>
-        <w:rPr/>
-        <w:t xml:space="preserve">§§ </w:t>
-      </w:r>
-      <w:r>
-        <w:rPr/>
-        <w:t>1331 and 1332</w:t>
+        <w:t>Plaintiff sued 35 Kentucky defendants under §§ 1331 and 1332</w:t>
       </w:r>
     </w:p>
     <w:p>
@@ -197,11 +181,7 @@
       </w:pPr>
       <w:r>
         <w:rPr/>
-        <w:t xml:space="preserve">Rule 12(b)(1) granted </w:t>
-      </w:r>
-      <w:r>
-        <w:rPr/>
-        <w:t xml:space="preserve">for lack of subject matter jurisdiction </w:t>
+        <w:t xml:space="preserve">Rule 12(b)(1) granted for lack of subject matter jurisdiction </w:t>
       </w:r>
     </w:p>
     <w:p>
@@ -867,6 +847,2566 @@
           <w:bCs w:val="false"/>
         </w:rPr>
         <w:t>He petitioned a Kentucky court to set aside the divorce decree so as to reclaim the farm</w:t>
+      </w:r>
+    </w:p>
+    <w:p>
+      <w:pPr>
+        <w:pStyle w:val="Normal"/>
+        <w:bidi w:val="0"/>
+        <w:jc w:val="left"/>
+        <w:rPr>
+          <w:b w:val="false"/>
+          <w:b w:val="false"/>
+          <w:bCs w:val="false"/>
+        </w:rPr>
+      </w:pPr>
+      <w:r>
+        <w:rPr>
+          <w:b w:val="false"/>
+          <w:bCs w:val="false"/>
+        </w:rPr>
+        <w:t>Issue</w:t>
+      </w:r>
+    </w:p>
+    <w:p>
+      <w:pPr>
+        <w:pStyle w:val="Normal"/>
+        <w:numPr>
+          <w:ilvl w:val="0"/>
+          <w:numId w:val="11"/>
+        </w:numPr>
+        <w:bidi w:val="0"/>
+        <w:jc w:val="left"/>
+        <w:rPr>
+          <w:b w:val="false"/>
+          <w:b w:val="false"/>
+          <w:bCs w:val="false"/>
+        </w:rPr>
+      </w:pPr>
+      <w:r>
+        <w:rPr>
+          <w:b w:val="false"/>
+          <w:bCs w:val="false"/>
+        </w:rPr>
+        <w:t>Whether Mr. Pitt had abandoned his Kentucky domicile and acquired a Tennessee domicile as of the September 10, 2013 filing date</w:t>
+      </w:r>
+    </w:p>
+    <w:p>
+      <w:pPr>
+        <w:pStyle w:val="Normal"/>
+        <w:bidi w:val="0"/>
+        <w:jc w:val="left"/>
+        <w:rPr>
+          <w:b w:val="false"/>
+          <w:b w:val="false"/>
+          <w:bCs w:val="false"/>
+        </w:rPr>
+      </w:pPr>
+      <w:r>
+        <w:rPr>
+          <w:b w:val="false"/>
+          <w:bCs w:val="false"/>
+        </w:rPr>
+        <w:t>Holding</w:t>
+      </w:r>
+    </w:p>
+    <w:p>
+      <w:pPr>
+        <w:pStyle w:val="Normal"/>
+        <w:numPr>
+          <w:ilvl w:val="0"/>
+          <w:numId w:val="10"/>
+        </w:numPr>
+        <w:bidi w:val="0"/>
+        <w:jc w:val="left"/>
+        <w:rPr>
+          <w:b w:val="false"/>
+          <w:b w:val="false"/>
+          <w:bCs w:val="false"/>
+        </w:rPr>
+      </w:pPr>
+      <w:r>
+        <w:rPr>
+          <w:b w:val="false"/>
+          <w:bCs w:val="false"/>
+        </w:rPr>
+        <w:t>No, Mr. Pitt remained a Kentucky citizen, diversity was absent and the case was dismissed</w:t>
+      </w:r>
+    </w:p>
+    <w:p>
+      <w:pPr>
+        <w:pStyle w:val="Normal"/>
+        <w:bidi w:val="0"/>
+        <w:jc w:val="left"/>
+        <w:rPr>
+          <w:b w:val="false"/>
+          <w:b w:val="false"/>
+          <w:bCs w:val="false"/>
+        </w:rPr>
+      </w:pPr>
+      <w:r>
+        <w:rPr>
+          <w:b w:val="false"/>
+          <w:bCs w:val="false"/>
+        </w:rPr>
+        <w:t>Reasoning</w:t>
+      </w:r>
+    </w:p>
+    <w:p>
+      <w:pPr>
+        <w:pStyle w:val="Normal"/>
+        <w:numPr>
+          <w:ilvl w:val="0"/>
+          <w:numId w:val="12"/>
+        </w:numPr>
+        <w:bidi w:val="0"/>
+        <w:jc w:val="left"/>
+        <w:rPr/>
+      </w:pPr>
+      <w:r>
+        <w:rPr>
+          <w:b w:val="false"/>
+          <w:bCs w:val="false"/>
+        </w:rPr>
+        <w:t>Physical presence in Tennessee was satisfied but intent as a Tennessee citizen was not</w:t>
+      </w:r>
+    </w:p>
+    <w:p>
+      <w:pPr>
+        <w:pStyle w:val="Normal"/>
+        <w:numPr>
+          <w:ilvl w:val="0"/>
+          <w:numId w:val="12"/>
+        </w:numPr>
+        <w:bidi w:val="0"/>
+        <w:jc w:val="left"/>
+        <w:rPr/>
+      </w:pPr>
+      <w:r>
+        <w:rPr>
+          <w:b w:val="false"/>
+          <w:bCs w:val="false"/>
+        </w:rPr>
+        <w:t>Presence that is compelled does not move domicile, “one who is in a place solely by virtue of superior force exerted by another should not be held to have abandoned his former domicile.” Stifel, 477 F.2d at 1121; see also Denlinger v. Brennan, 87 F.3d 214, 216 (7th Cir.1996)</w:t>
+      </w:r>
+    </w:p>
+    <w:p>
+      <w:pPr>
+        <w:pStyle w:val="Normal"/>
+        <w:numPr>
+          <w:ilvl w:val="0"/>
+          <w:numId w:val="12"/>
+        </w:numPr>
+        <w:bidi w:val="0"/>
+        <w:jc w:val="left"/>
+        <w:rPr/>
+      </w:pPr>
+      <w:r>
+        <w:rPr>
+          <w:b w:val="false"/>
+          <w:bCs w:val="false"/>
+        </w:rPr>
+        <w:t>Pitt spent two to three nights per week at the Kentucky farm which indicates that he had a continued desire to remain domiciled there</w:t>
+      </w:r>
+    </w:p>
+    <w:p>
+      <w:pPr>
+        <w:pStyle w:val="Normal"/>
+        <w:numPr>
+          <w:ilvl w:val="0"/>
+          <w:numId w:val="12"/>
+        </w:numPr>
+        <w:bidi w:val="0"/>
+        <w:jc w:val="left"/>
+        <w:rPr/>
+      </w:pPr>
+      <w:r>
+        <w:rPr>
+          <w:b w:val="false"/>
+          <w:bCs w:val="false"/>
+        </w:rPr>
+        <w:t>Pitt pursued actions to reclaim his old house which indicated continued attachment to Kentucky domicile</w:t>
+      </w:r>
+    </w:p>
+    <w:p>
+      <w:pPr>
+        <w:pStyle w:val="Normal"/>
+        <w:numPr>
+          <w:ilvl w:val="0"/>
+          <w:numId w:val="12"/>
+        </w:numPr>
+        <w:bidi w:val="0"/>
+        <w:jc w:val="left"/>
+        <w:rPr>
+          <w:b w:val="false"/>
+          <w:b w:val="false"/>
+          <w:bCs w:val="false"/>
+        </w:rPr>
+      </w:pPr>
+      <w:r>
+        <w:rPr>
+          <w:b w:val="false"/>
+          <w:bCs w:val="false"/>
+        </w:rPr>
+        <w:t>The district court found that the LLC was used to manufacture diversity</w:t>
+      </w:r>
+    </w:p>
+    <w:p>
+      <w:pPr>
+        <w:pStyle w:val="Normal"/>
+        <w:bidi w:val="0"/>
+        <w:jc w:val="left"/>
+        <w:rPr>
+          <w:b w:val="false"/>
+          <w:b w:val="false"/>
+          <w:bCs w:val="false"/>
+        </w:rPr>
+      </w:pPr>
+      <w:r>
+        <w:rPr>
+          <w:b w:val="false"/>
+          <w:bCs w:val="false"/>
+        </w:rPr>
+        <w:t>Relation to Fox Case</w:t>
+      </w:r>
+    </w:p>
+    <w:p>
+      <w:pPr>
+        <w:pStyle w:val="Normal"/>
+        <w:numPr>
+          <w:ilvl w:val="0"/>
+          <w:numId w:val="13"/>
+        </w:numPr>
+        <w:bidi w:val="0"/>
+        <w:jc w:val="left"/>
+        <w:rPr/>
+      </w:pPr>
+      <w:r>
+        <w:rPr>
+          <w:b w:val="false"/>
+          <w:bCs w:val="false"/>
+        </w:rPr>
+        <w:t>Fox spends one to two nights per week in Kentucky and the rest in Tennessee, under the reasoning of Pitt, the majority of nights in the old domicile is evidence of continuity</w:t>
+      </w:r>
+    </w:p>
+    <w:p>
+      <w:pPr>
+        <w:pStyle w:val="Normal"/>
+        <w:numPr>
+          <w:ilvl w:val="0"/>
+          <w:numId w:val="13"/>
+        </w:numPr>
+        <w:bidi w:val="0"/>
+        <w:jc w:val="left"/>
+        <w:rPr/>
+      </w:pPr>
+      <w:r>
+        <w:rPr>
+          <w:b w:val="false"/>
+          <w:bCs w:val="false"/>
+        </w:rPr>
+        <w:t>Nothing about Fox’s Kentucky presence is compelled but it is not exclusive either</w:t>
+      </w:r>
+    </w:p>
+    <w:p>
+      <w:pPr>
+        <w:pStyle w:val="Normal"/>
+        <w:bidi w:val="0"/>
+        <w:jc w:val="left"/>
+        <w:rPr/>
+      </w:pPr>
+      <w:r>
+        <w:rPr/>
+      </w:r>
+    </w:p>
+    <w:p>
+      <w:pPr>
+        <w:pStyle w:val="Normal"/>
+        <w:bidi w:val="0"/>
+        <w:jc w:val="left"/>
+        <w:rPr>
+          <w:b/>
+          <w:b/>
+          <w:bCs/>
+        </w:rPr>
+      </w:pPr>
+      <w:r>
+        <w:rPr>
+          <w:b/>
+          <w:bCs/>
+        </w:rPr>
+        <w:t>Robinette v. Emmons</w:t>
+      </w:r>
+    </w:p>
+    <w:p>
+      <w:pPr>
+        <w:pStyle w:val="Normal"/>
+        <w:bidi w:val="0"/>
+        <w:jc w:val="left"/>
+        <w:rPr>
+          <w:b w:val="false"/>
+          <w:b w:val="false"/>
+          <w:bCs w:val="false"/>
+        </w:rPr>
+      </w:pPr>
+      <w:r>
+        <w:rPr>
+          <w:b w:val="false"/>
+          <w:bCs w:val="false"/>
+        </w:rPr>
+        <w:t>Posture</w:t>
+      </w:r>
+    </w:p>
+    <w:p>
+      <w:pPr>
+        <w:pStyle w:val="Normal"/>
+        <w:numPr>
+          <w:ilvl w:val="0"/>
+          <w:numId w:val="15"/>
+        </w:numPr>
+        <w:bidi w:val="0"/>
+        <w:jc w:val="left"/>
+        <w:rPr>
+          <w:b w:val="false"/>
+          <w:b w:val="false"/>
+          <w:bCs w:val="false"/>
+        </w:rPr>
+      </w:pPr>
+      <w:r>
+        <w:rPr>
+          <w:b w:val="false"/>
+          <w:bCs w:val="false"/>
+        </w:rPr>
+        <w:t>Defendant removed the case from state court to federal court</w:t>
+      </w:r>
+    </w:p>
+    <w:p>
+      <w:pPr>
+        <w:pStyle w:val="Normal"/>
+        <w:numPr>
+          <w:ilvl w:val="0"/>
+          <w:numId w:val="15"/>
+        </w:numPr>
+        <w:bidi w:val="0"/>
+        <w:jc w:val="left"/>
+        <w:rPr>
+          <w:b w:val="false"/>
+          <w:b w:val="false"/>
+          <w:bCs w:val="false"/>
+        </w:rPr>
+      </w:pPr>
+      <w:r>
+        <w:rPr>
+          <w:b w:val="false"/>
+          <w:bCs w:val="false"/>
+        </w:rPr>
+        <w:t>The court sua sponte (on its own accord) ordered a show-cause briefing to determine if the case should continue in the jurisdiction it was in</w:t>
+      </w:r>
+    </w:p>
+    <w:p>
+      <w:pPr>
+        <w:pStyle w:val="Normal"/>
+        <w:numPr>
+          <w:ilvl w:val="0"/>
+          <w:numId w:val="15"/>
+        </w:numPr>
+        <w:bidi w:val="0"/>
+        <w:jc w:val="left"/>
+        <w:rPr>
+          <w:b w:val="false"/>
+          <w:b w:val="false"/>
+          <w:bCs w:val="false"/>
+        </w:rPr>
+      </w:pPr>
+      <w:r>
+        <w:rPr>
+          <w:b w:val="false"/>
+          <w:bCs w:val="false"/>
+        </w:rPr>
+        <w:t xml:space="preserve">Only State Farm responded </w:t>
+      </w:r>
+    </w:p>
+    <w:p>
+      <w:pPr>
+        <w:pStyle w:val="Normal"/>
+        <w:numPr>
+          <w:ilvl w:val="0"/>
+          <w:numId w:val="15"/>
+        </w:numPr>
+        <w:bidi w:val="0"/>
+        <w:jc w:val="left"/>
+        <w:rPr>
+          <w:b w:val="false"/>
+          <w:b w:val="false"/>
+          <w:bCs w:val="false"/>
+        </w:rPr>
+      </w:pPr>
+      <w:r>
+        <w:rPr>
+          <w:b w:val="false"/>
+          <w:bCs w:val="false"/>
+        </w:rPr>
+        <w:t>The court discharged the show cause order and retained the case</w:t>
+      </w:r>
+    </w:p>
+    <w:p>
+      <w:pPr>
+        <w:pStyle w:val="Normal"/>
+        <w:numPr>
+          <w:ilvl w:val="0"/>
+          <w:numId w:val="15"/>
+        </w:numPr>
+        <w:bidi w:val="0"/>
+        <w:jc w:val="left"/>
+        <w:rPr>
+          <w:b w:val="false"/>
+          <w:b w:val="false"/>
+          <w:bCs w:val="false"/>
+        </w:rPr>
+      </w:pPr>
+      <w:r>
+        <w:rPr>
+          <w:b w:val="false"/>
+          <w:bCs w:val="false"/>
+        </w:rPr>
+        <w:t xml:space="preserve">State Farm the defendant wanted Emmons to be a Michigan citizen </w:t>
+      </w:r>
+    </w:p>
+    <w:p>
+      <w:pPr>
+        <w:pStyle w:val="Normal"/>
+        <w:numPr>
+          <w:ilvl w:val="0"/>
+          <w:numId w:val="15"/>
+        </w:numPr>
+        <w:bidi w:val="0"/>
+        <w:jc w:val="left"/>
+        <w:rPr>
+          <w:b w:val="false"/>
+          <w:b w:val="false"/>
+          <w:bCs w:val="false"/>
+        </w:rPr>
+      </w:pPr>
+      <w:r>
+        <w:rPr>
+          <w:b w:val="false"/>
+          <w:bCs w:val="false"/>
+        </w:rPr>
+        <w:t xml:space="preserve">The plaintiffs wanted Emmons to be a Kentucky defendant </w:t>
+      </w:r>
+    </w:p>
+    <w:p>
+      <w:pPr>
+        <w:pStyle w:val="Normal"/>
+        <w:bidi w:val="0"/>
+        <w:jc w:val="left"/>
+        <w:rPr>
+          <w:b w:val="false"/>
+          <w:b w:val="false"/>
+          <w:bCs w:val="false"/>
+        </w:rPr>
+      </w:pPr>
+      <w:r>
+        <w:rPr>
+          <w:b w:val="false"/>
+          <w:bCs w:val="false"/>
+        </w:rPr>
+        <w:t>Facts</w:t>
+      </w:r>
+    </w:p>
+    <w:p>
+      <w:pPr>
+        <w:pStyle w:val="Normal"/>
+        <w:numPr>
+          <w:ilvl w:val="0"/>
+          <w:numId w:val="14"/>
+        </w:numPr>
+        <w:bidi w:val="0"/>
+        <w:jc w:val="left"/>
+        <w:rPr>
+          <w:b w:val="false"/>
+          <w:b w:val="false"/>
+          <w:bCs w:val="false"/>
+        </w:rPr>
+      </w:pPr>
+      <w:r>
+        <w:rPr>
+          <w:b w:val="false"/>
+          <w:bCs w:val="false"/>
+        </w:rPr>
+        <w:t>The complaint alleged that the defendant Emmons was a non-resident of Kentucky who resided in Michigan</w:t>
+      </w:r>
+    </w:p>
+    <w:p>
+      <w:pPr>
+        <w:pStyle w:val="Normal"/>
+        <w:numPr>
+          <w:ilvl w:val="0"/>
+          <w:numId w:val="14"/>
+        </w:numPr>
+        <w:bidi w:val="0"/>
+        <w:jc w:val="left"/>
+        <w:rPr>
+          <w:b w:val="false"/>
+          <w:b w:val="false"/>
+          <w:bCs w:val="false"/>
+        </w:rPr>
+      </w:pPr>
+      <w:r>
+        <w:rPr>
+          <w:b w:val="false"/>
+          <w:bCs w:val="false"/>
+        </w:rPr>
+        <w:t xml:space="preserve">State Farm’s notice of removal responded to the allegation with a response that Emmons was a domiciliary and citizen of Michigan </w:t>
+      </w:r>
+    </w:p>
+    <w:p>
+      <w:pPr>
+        <w:pStyle w:val="Normal"/>
+        <w:numPr>
+          <w:ilvl w:val="0"/>
+          <w:numId w:val="14"/>
+        </w:numPr>
+        <w:bidi w:val="0"/>
+        <w:jc w:val="left"/>
+        <w:rPr>
+          <w:b w:val="false"/>
+          <w:b w:val="false"/>
+          <w:bCs w:val="false"/>
+        </w:rPr>
+      </w:pPr>
+      <w:r>
+        <w:rPr>
+          <w:b w:val="false"/>
+          <w:bCs w:val="false"/>
+        </w:rPr>
+        <w:t>The defendants showed the Facebook profile of Emmons saying she lived in Kentucky and is from Michigan</w:t>
+      </w:r>
+    </w:p>
+    <w:p>
+      <w:pPr>
+        <w:pStyle w:val="Normal"/>
+        <w:numPr>
+          <w:ilvl w:val="0"/>
+          <w:numId w:val="14"/>
+        </w:numPr>
+        <w:bidi w:val="0"/>
+        <w:jc w:val="left"/>
+        <w:rPr>
+          <w:b w:val="false"/>
+          <w:b w:val="false"/>
+          <w:bCs w:val="false"/>
+        </w:rPr>
+      </w:pPr>
+      <w:r>
+        <w:rPr>
+          <w:b w:val="false"/>
+          <w:bCs w:val="false"/>
+        </w:rPr>
+        <w:t>Proof that Emmons was not registered to vote in Kentucky and had no Kentucky driver’s license</w:t>
+      </w:r>
+    </w:p>
+    <w:p>
+      <w:pPr>
+        <w:pStyle w:val="Normal"/>
+        <w:numPr>
+          <w:ilvl w:val="0"/>
+          <w:numId w:val="14"/>
+        </w:numPr>
+        <w:bidi w:val="0"/>
+        <w:jc w:val="left"/>
+        <w:rPr>
+          <w:b w:val="false"/>
+          <w:b w:val="false"/>
+          <w:bCs w:val="false"/>
+        </w:rPr>
+      </w:pPr>
+      <w:r>
+        <w:rPr>
+          <w:b w:val="false"/>
+          <w:bCs w:val="false"/>
+        </w:rPr>
+        <w:t>The defendants presented an address history that showed 13 years of Michigan addresses with only 6 months of Kentucky addresses</w:t>
+      </w:r>
+    </w:p>
+    <w:p>
+      <w:pPr>
+        <w:pStyle w:val="Normal"/>
+        <w:bidi w:val="0"/>
+        <w:jc w:val="left"/>
+        <w:rPr>
+          <w:b w:val="false"/>
+          <w:b w:val="false"/>
+          <w:bCs w:val="false"/>
+        </w:rPr>
+      </w:pPr>
+      <w:r>
+        <w:rPr>
+          <w:b w:val="false"/>
+          <w:bCs w:val="false"/>
+        </w:rPr>
+        <w:t>Issue</w:t>
+      </w:r>
+    </w:p>
+    <w:p>
+      <w:pPr>
+        <w:pStyle w:val="Normal"/>
+        <w:numPr>
+          <w:ilvl w:val="0"/>
+          <w:numId w:val="16"/>
+        </w:numPr>
+        <w:bidi w:val="0"/>
+        <w:jc w:val="left"/>
+        <w:rPr>
+          <w:b w:val="false"/>
+          <w:b w:val="false"/>
+          <w:bCs w:val="false"/>
+        </w:rPr>
+      </w:pPr>
+      <w:r>
+        <w:rPr>
+          <w:b w:val="false"/>
+          <w:bCs w:val="false"/>
+        </w:rPr>
+        <w:t>Did the removing defendant meet the burden of establishing diversity</w:t>
+      </w:r>
+    </w:p>
+    <w:p>
+      <w:pPr>
+        <w:pStyle w:val="Normal"/>
+        <w:bidi w:val="0"/>
+        <w:jc w:val="left"/>
+        <w:rPr>
+          <w:b w:val="false"/>
+          <w:b w:val="false"/>
+          <w:bCs w:val="false"/>
+        </w:rPr>
+      </w:pPr>
+      <w:r>
+        <w:rPr>
+          <w:b w:val="false"/>
+          <w:bCs w:val="false"/>
+        </w:rPr>
+        <w:t>Holding</w:t>
+      </w:r>
+    </w:p>
+    <w:p>
+      <w:pPr>
+        <w:pStyle w:val="Normal"/>
+        <w:numPr>
+          <w:ilvl w:val="0"/>
+          <w:numId w:val="17"/>
+        </w:numPr>
+        <w:bidi w:val="0"/>
+        <w:jc w:val="left"/>
+        <w:rPr>
+          <w:b w:val="false"/>
+          <w:b w:val="false"/>
+          <w:bCs w:val="false"/>
+        </w:rPr>
+      </w:pPr>
+      <w:r>
+        <w:rPr>
+          <w:b w:val="false"/>
+          <w:bCs w:val="false"/>
+        </w:rPr>
+        <w:t>Yes, Emmons was a Michigan citizen, complete diversity existed and the case was retained</w:t>
+      </w:r>
+    </w:p>
+    <w:p>
+      <w:pPr>
+        <w:pStyle w:val="Normal"/>
+        <w:bidi w:val="0"/>
+        <w:jc w:val="left"/>
+        <w:rPr>
+          <w:b w:val="false"/>
+          <w:b w:val="false"/>
+          <w:bCs w:val="false"/>
+        </w:rPr>
+      </w:pPr>
+      <w:r>
+        <w:rPr>
+          <w:b w:val="false"/>
+          <w:bCs w:val="false"/>
+        </w:rPr>
+        <w:t>Reasoning</w:t>
+      </w:r>
+    </w:p>
+    <w:p>
+      <w:pPr>
+        <w:pStyle w:val="Normal"/>
+        <w:numPr>
+          <w:ilvl w:val="0"/>
+          <w:numId w:val="18"/>
+        </w:numPr>
+        <w:bidi w:val="0"/>
+        <w:jc w:val="left"/>
+        <w:rPr>
+          <w:b w:val="false"/>
+          <w:b w:val="false"/>
+          <w:bCs w:val="false"/>
+        </w:rPr>
+      </w:pPr>
+      <w:r>
+        <w:rPr>
+          <w:b w:val="false"/>
+          <w:bCs w:val="false"/>
+        </w:rPr>
+        <w:t xml:space="preserve">The burden is on the removing defendant </w:t>
+      </w:r>
+    </w:p>
+    <w:p>
+      <w:pPr>
+        <w:pStyle w:val="Normal"/>
+        <w:numPr>
+          <w:ilvl w:val="0"/>
+          <w:numId w:val="18"/>
+        </w:numPr>
+        <w:bidi w:val="0"/>
+        <w:jc w:val="left"/>
+        <w:rPr>
+          <w:b w:val="false"/>
+          <w:b w:val="false"/>
+          <w:bCs w:val="false"/>
+        </w:rPr>
+      </w:pPr>
+      <w:r>
+        <w:rPr>
+          <w:b w:val="false"/>
+          <w:bCs w:val="false"/>
+        </w:rPr>
+        <w:t>Emmon’s long term domicile indicated she was a resident of Michigan. Courts consistently</w:t>
+      </w:r>
+    </w:p>
+    <w:p>
+      <w:pPr>
+        <w:pStyle w:val="Normal"/>
+        <w:numPr>
+          <w:ilvl w:val="0"/>
+          <w:numId w:val="18"/>
+        </w:numPr>
+        <w:bidi w:val="0"/>
+        <w:jc w:val="left"/>
+        <w:rPr>
+          <w:b w:val="false"/>
+          <w:b w:val="false"/>
+          <w:bCs w:val="false"/>
+        </w:rPr>
+      </w:pPr>
+      <w:r>
+        <w:rPr>
+          <w:b w:val="false"/>
+          <w:bCs w:val="false"/>
+        </w:rPr>
+        <w:t>reject such short-term, transient abnormalities as citizenship markers. See, e.g., Myrick, 764 F.3d at 664</w:t>
+      </w:r>
+    </w:p>
+    <w:p>
+      <w:pPr>
+        <w:pStyle w:val="Normal"/>
+        <w:numPr>
+          <w:ilvl w:val="0"/>
+          <w:numId w:val="18"/>
+        </w:numPr>
+        <w:bidi w:val="0"/>
+        <w:jc w:val="left"/>
+        <w:rPr>
+          <w:b w:val="false"/>
+          <w:b w:val="false"/>
+          <w:bCs w:val="false"/>
+        </w:rPr>
+      </w:pPr>
+      <w:r>
+        <w:rPr>
+          <w:b w:val="false"/>
+          <w:bCs w:val="false"/>
+        </w:rPr>
+        <w:t>Absence of voter registration and driver’s license indicates a desire not to acquire citizenship in Kentucky</w:t>
+      </w:r>
+    </w:p>
+    <w:p>
+      <w:pPr>
+        <w:pStyle w:val="Normal"/>
+        <w:bidi w:val="0"/>
+        <w:jc w:val="left"/>
+        <w:rPr>
+          <w:b w:val="false"/>
+          <w:b w:val="false"/>
+          <w:bCs w:val="false"/>
+        </w:rPr>
+      </w:pPr>
+      <w:r>
+        <w:rPr>
+          <w:b w:val="false"/>
+          <w:bCs w:val="false"/>
+        </w:rPr>
+        <w:t>Relation to Fox Case</w:t>
+      </w:r>
+    </w:p>
+    <w:p>
+      <w:pPr>
+        <w:pStyle w:val="Normal"/>
+        <w:numPr>
+          <w:ilvl w:val="0"/>
+          <w:numId w:val="19"/>
+        </w:numPr>
+        <w:bidi w:val="0"/>
+        <w:jc w:val="left"/>
+        <w:rPr>
+          <w:b w:val="false"/>
+          <w:b w:val="false"/>
+          <w:bCs w:val="false"/>
+        </w:rPr>
+      </w:pPr>
+      <w:r>
+        <w:rPr>
+          <w:b w:val="false"/>
+          <w:bCs w:val="false"/>
+        </w:rPr>
+        <w:t>Fox’s Facebook says he lives in Kentucky and he changed it when his house was finished, however the Robinette case establishes that it does not prove much because you can live on one state and intend on returning to another</w:t>
+      </w:r>
+    </w:p>
+    <w:p>
+      <w:pPr>
+        <w:pStyle w:val="Normal"/>
+        <w:numPr>
+          <w:ilvl w:val="0"/>
+          <w:numId w:val="19"/>
+        </w:numPr>
+        <w:bidi w:val="0"/>
+        <w:jc w:val="left"/>
+        <w:rPr>
+          <w:b w:val="false"/>
+          <w:b w:val="false"/>
+          <w:bCs w:val="false"/>
+        </w:rPr>
+      </w:pPr>
+      <w:r>
+        <w:rPr>
+          <w:b w:val="false"/>
+          <w:bCs w:val="false"/>
+        </w:rPr>
+        <w:t>In Robinette the defendant removed the case successfully and it states that the removing defendant carries the burden, meaning that in the Fox case the burden is on the tech company to prove he is not a Tennessee resident</w:t>
+      </w:r>
+    </w:p>
+    <w:p>
+      <w:pPr>
+        <w:pStyle w:val="Normal"/>
+        <w:numPr>
+          <w:ilvl w:val="0"/>
+          <w:numId w:val="19"/>
+        </w:numPr>
+        <w:bidi w:val="0"/>
+        <w:jc w:val="left"/>
+        <w:rPr>
+          <w:b w:val="false"/>
+          <w:b w:val="false"/>
+          <w:bCs w:val="false"/>
+        </w:rPr>
+      </w:pPr>
+      <w:r>
+        <w:rPr>
+          <w:b w:val="false"/>
+          <w:bCs w:val="false"/>
+        </w:rPr>
+        <w:t>Robinette says citizenship reflects where one plans to live in the long run, Fox told Casco he hopes to settle in Bowling Green after he marries, however that plan is contingent on something that has not happened. Also domicile is fixed as of the day that the suit was filed (July 2026) when Fox lived in Nashville, worked in Nashville ans was not engaged</w:t>
+      </w:r>
+    </w:p>
+    <w:p>
+      <w:pPr>
+        <w:pStyle w:val="Normal"/>
+        <w:bidi w:val="0"/>
+        <w:jc w:val="left"/>
+        <w:rPr>
+          <w:b w:val="false"/>
+          <w:b w:val="false"/>
+          <w:bCs w:val="false"/>
+        </w:rPr>
+      </w:pPr>
+      <w:r>
+        <w:rPr>
+          <w:b w:val="false"/>
+          <w:bCs w:val="false"/>
+        </w:rPr>
+      </w:r>
+    </w:p>
+    <w:tbl>
+      <w:tblPr>
+        <w:tblW w:w="5000" w:type="pct"/>
+        <w:jc w:val="left"/>
+        <w:tblInd w:w="-5" w:type="dxa"/>
+        <w:tblLayout w:type="fixed"/>
+        <w:tblCellMar>
+          <w:top w:w="55" w:type="dxa"/>
+          <w:left w:w="55" w:type="dxa"/>
+          <w:bottom w:w="55" w:type="dxa"/>
+          <w:right w:w="55" w:type="dxa"/>
+        </w:tblCellMar>
+      </w:tblPr>
+      <w:tblGrid>
+        <w:gridCol w:w="1994"/>
+        <w:gridCol w:w="1993"/>
+        <w:gridCol w:w="1996"/>
+        <w:gridCol w:w="1993"/>
+        <w:gridCol w:w="1996"/>
+      </w:tblGrid>
+      <w:tr>
+        <w:trPr/>
+        <w:tc>
+          <w:tcPr>
+            <w:tcW w:w="1994" w:type="dxa"/>
+            <w:tcBorders>
+              <w:top w:val="single" w:sz="4" w:space="0" w:color="000000"/>
+              <w:left w:val="single" w:sz="4" w:space="0" w:color="000000"/>
+              <w:bottom w:val="single" w:sz="4" w:space="0" w:color="000000"/>
+            </w:tcBorders>
+          </w:tcPr>
+          <w:p>
+            <w:pPr>
+              <w:pStyle w:val="TableContents"/>
+              <w:widowControl w:val="false"/>
+              <w:rPr/>
+            </w:pPr>
+            <w:r>
+              <w:rPr/>
+            </w:r>
+          </w:p>
+        </w:tc>
+        <w:tc>
+          <w:tcPr>
+            <w:tcW w:w="1993" w:type="dxa"/>
+            <w:tcBorders>
+              <w:top w:val="single" w:sz="4" w:space="0" w:color="000000"/>
+              <w:left w:val="single" w:sz="4" w:space="0" w:color="000000"/>
+              <w:bottom w:val="single" w:sz="4" w:space="0" w:color="000000"/>
+            </w:tcBorders>
+          </w:tcPr>
+          <w:p>
+            <w:pPr>
+              <w:pStyle w:val="TableContents"/>
+              <w:widowControl w:val="false"/>
+              <w:rPr/>
+            </w:pPr>
+            <w:r>
+              <w:rPr/>
+              <w:t>Deasy</w:t>
+            </w:r>
+          </w:p>
+        </w:tc>
+        <w:tc>
+          <w:tcPr>
+            <w:tcW w:w="1996" w:type="dxa"/>
+            <w:tcBorders>
+              <w:top w:val="single" w:sz="4" w:space="0" w:color="000000"/>
+              <w:left w:val="single" w:sz="4" w:space="0" w:color="000000"/>
+              <w:bottom w:val="single" w:sz="4" w:space="0" w:color="000000"/>
+            </w:tcBorders>
+          </w:tcPr>
+          <w:p>
+            <w:pPr>
+              <w:pStyle w:val="TableContents"/>
+              <w:widowControl w:val="false"/>
+              <w:rPr/>
+            </w:pPr>
+            <w:r>
+              <w:rPr/>
+              <w:t>Pitt</w:t>
+            </w:r>
+          </w:p>
+        </w:tc>
+        <w:tc>
+          <w:tcPr>
+            <w:tcW w:w="1993" w:type="dxa"/>
+            <w:tcBorders>
+              <w:top w:val="single" w:sz="4" w:space="0" w:color="000000"/>
+              <w:left w:val="single" w:sz="4" w:space="0" w:color="000000"/>
+              <w:bottom w:val="single" w:sz="4" w:space="0" w:color="000000"/>
+            </w:tcBorders>
+          </w:tcPr>
+          <w:p>
+            <w:pPr>
+              <w:pStyle w:val="TableContents"/>
+              <w:widowControl w:val="false"/>
+              <w:rPr/>
+            </w:pPr>
+            <w:r>
+              <w:rPr/>
+              <w:t>Robinette</w:t>
+            </w:r>
+          </w:p>
+        </w:tc>
+        <w:tc>
+          <w:tcPr>
+            <w:tcW w:w="1996" w:type="dxa"/>
+            <w:tcBorders>
+              <w:top w:val="single" w:sz="4" w:space="0" w:color="000000"/>
+              <w:left w:val="single" w:sz="4" w:space="0" w:color="000000"/>
+              <w:bottom w:val="single" w:sz="4" w:space="0" w:color="000000"/>
+              <w:right w:val="single" w:sz="4" w:space="0" w:color="000000"/>
+            </w:tcBorders>
+          </w:tcPr>
+          <w:p>
+            <w:pPr>
+              <w:pStyle w:val="TableContents"/>
+              <w:widowControl w:val="false"/>
+              <w:rPr/>
+            </w:pPr>
+            <w:r>
+              <w:rPr/>
+              <w:t>Fox</w:t>
+            </w:r>
+          </w:p>
+        </w:tc>
+      </w:tr>
+      <w:tr>
+        <w:trPr/>
+        <w:tc>
+          <w:tcPr>
+            <w:tcW w:w="1994" w:type="dxa"/>
+            <w:tcBorders>
+              <w:left w:val="single" w:sz="4" w:space="0" w:color="000000"/>
+              <w:bottom w:val="single" w:sz="4" w:space="0" w:color="000000"/>
+            </w:tcBorders>
+          </w:tcPr>
+          <w:p>
+            <w:pPr>
+              <w:pStyle w:val="TableContents"/>
+              <w:widowControl w:val="false"/>
+              <w:rPr/>
+            </w:pPr>
+            <w:r>
+              <w:rPr/>
+              <w:t>Plaintiff</w:t>
+            </w:r>
+          </w:p>
+        </w:tc>
+        <w:tc>
+          <w:tcPr>
+            <w:tcW w:w="1993" w:type="dxa"/>
+            <w:tcBorders>
+              <w:left w:val="single" w:sz="4" w:space="0" w:color="000000"/>
+              <w:bottom w:val="single" w:sz="4" w:space="0" w:color="000000"/>
+            </w:tcBorders>
+          </w:tcPr>
+          <w:p>
+            <w:pPr>
+              <w:pStyle w:val="TableContents"/>
+              <w:widowControl w:val="false"/>
+              <w:rPr/>
+            </w:pPr>
+            <w:r>
+              <w:rPr/>
+              <w:t>William Wayne Deasy</w:t>
+            </w:r>
+          </w:p>
+        </w:tc>
+        <w:tc>
+          <w:tcPr>
+            <w:tcW w:w="1996" w:type="dxa"/>
+            <w:tcBorders>
+              <w:left w:val="single" w:sz="4" w:space="0" w:color="000000"/>
+              <w:bottom w:val="single" w:sz="4" w:space="0" w:color="000000"/>
+            </w:tcBorders>
+          </w:tcPr>
+          <w:p>
+            <w:pPr>
+              <w:pStyle w:val="TableContents"/>
+              <w:widowControl w:val="false"/>
+              <w:rPr/>
+            </w:pPr>
+            <w:r>
+              <w:rPr/>
+              <w:t>Pitt Excavating LLC (John Pitt)</w:t>
+            </w:r>
+          </w:p>
+        </w:tc>
+        <w:tc>
+          <w:tcPr>
+            <w:tcW w:w="1993" w:type="dxa"/>
+            <w:tcBorders>
+              <w:left w:val="single" w:sz="4" w:space="0" w:color="000000"/>
+              <w:bottom w:val="single" w:sz="4" w:space="0" w:color="000000"/>
+            </w:tcBorders>
+          </w:tcPr>
+          <w:p>
+            <w:pPr>
+              <w:pStyle w:val="TableContents"/>
+              <w:widowControl w:val="false"/>
+              <w:rPr/>
+            </w:pPr>
+            <w:r>
+              <w:rPr/>
+              <w:t>Ronald Robinette</w:t>
+            </w:r>
+          </w:p>
+        </w:tc>
+        <w:tc>
+          <w:tcPr>
+            <w:tcW w:w="1996" w:type="dxa"/>
+            <w:tcBorders>
+              <w:left w:val="single" w:sz="4" w:space="0" w:color="000000"/>
+              <w:bottom w:val="single" w:sz="4" w:space="0" w:color="000000"/>
+              <w:right w:val="single" w:sz="4" w:space="0" w:color="000000"/>
+            </w:tcBorders>
+          </w:tcPr>
+          <w:p>
+            <w:pPr>
+              <w:pStyle w:val="TableContents"/>
+              <w:widowControl w:val="false"/>
+              <w:rPr/>
+            </w:pPr>
+            <w:r>
+              <w:rPr/>
+              <w:t>Jalen Fox</w:t>
+            </w:r>
+          </w:p>
+        </w:tc>
+      </w:tr>
+      <w:tr>
+        <w:trPr/>
+        <w:tc>
+          <w:tcPr>
+            <w:tcW w:w="1994" w:type="dxa"/>
+            <w:tcBorders>
+              <w:left w:val="single" w:sz="4" w:space="0" w:color="000000"/>
+              <w:bottom w:val="single" w:sz="4" w:space="0" w:color="000000"/>
+            </w:tcBorders>
+          </w:tcPr>
+          <w:p>
+            <w:pPr>
+              <w:pStyle w:val="TableContents"/>
+              <w:widowControl w:val="false"/>
+              <w:rPr/>
+            </w:pPr>
+            <w:r>
+              <w:rPr/>
+              <w:t>Defendant</w:t>
+            </w:r>
+          </w:p>
+        </w:tc>
+        <w:tc>
+          <w:tcPr>
+            <w:tcW w:w="1993" w:type="dxa"/>
+            <w:tcBorders>
+              <w:left w:val="single" w:sz="4" w:space="0" w:color="000000"/>
+              <w:bottom w:val="single" w:sz="4" w:space="0" w:color="000000"/>
+            </w:tcBorders>
+          </w:tcPr>
+          <w:p>
+            <w:pPr>
+              <w:pStyle w:val="TableContents"/>
+              <w:widowControl w:val="false"/>
+              <w:rPr/>
+            </w:pPr>
+            <w:r>
+              <w:rPr/>
+              <w:t>Louisville &amp; Jefferson Country Metro Sewer District</w:t>
+            </w:r>
+          </w:p>
+        </w:tc>
+        <w:tc>
+          <w:tcPr>
+            <w:tcW w:w="1996" w:type="dxa"/>
+            <w:tcBorders>
+              <w:left w:val="single" w:sz="4" w:space="0" w:color="000000"/>
+              <w:bottom w:val="single" w:sz="4" w:space="0" w:color="000000"/>
+            </w:tcBorders>
+          </w:tcPr>
+          <w:p>
+            <w:pPr>
+              <w:pStyle w:val="TableContents"/>
+              <w:widowControl w:val="false"/>
+              <w:rPr/>
+            </w:pPr>
+            <w:r>
+              <w:rPr/>
+              <w:t>Mary Lou Pitt</w:t>
+            </w:r>
+          </w:p>
+        </w:tc>
+        <w:tc>
+          <w:tcPr>
+            <w:tcW w:w="1993" w:type="dxa"/>
+            <w:tcBorders>
+              <w:left w:val="single" w:sz="4" w:space="0" w:color="000000"/>
+              <w:bottom w:val="single" w:sz="4" w:space="0" w:color="000000"/>
+            </w:tcBorders>
+          </w:tcPr>
+          <w:p>
+            <w:pPr>
+              <w:pStyle w:val="TableContents"/>
+              <w:widowControl w:val="false"/>
+              <w:rPr/>
+            </w:pPr>
+            <w:r>
+              <w:rPr/>
+              <w:t xml:space="preserve">Shawna Emmons and State Farm Mutual </w:t>
+            </w:r>
+          </w:p>
+        </w:tc>
+        <w:tc>
+          <w:tcPr>
+            <w:tcW w:w="1996" w:type="dxa"/>
+            <w:tcBorders>
+              <w:left w:val="single" w:sz="4" w:space="0" w:color="000000"/>
+              <w:bottom w:val="single" w:sz="4" w:space="0" w:color="000000"/>
+              <w:right w:val="single" w:sz="4" w:space="0" w:color="000000"/>
+            </w:tcBorders>
+          </w:tcPr>
+          <w:p>
+            <w:pPr>
+              <w:pStyle w:val="TableContents"/>
+              <w:widowControl w:val="false"/>
+              <w:rPr/>
+            </w:pPr>
+            <w:r>
+              <w:rPr/>
+              <w:t>Tech company in Tennessee</w:t>
+            </w:r>
+          </w:p>
+        </w:tc>
+      </w:tr>
+      <w:tr>
+        <w:trPr/>
+        <w:tc>
+          <w:tcPr>
+            <w:tcW w:w="1994" w:type="dxa"/>
+            <w:tcBorders>
+              <w:left w:val="single" w:sz="4" w:space="0" w:color="000000"/>
+              <w:bottom w:val="single" w:sz="4" w:space="0" w:color="000000"/>
+            </w:tcBorders>
+          </w:tcPr>
+          <w:p>
+            <w:pPr>
+              <w:pStyle w:val="TableContents"/>
+              <w:widowControl w:val="false"/>
+              <w:rPr/>
+            </w:pPr>
+            <w:r>
+              <w:rPr/>
+              <w:t>Why Plaintiff sued</w:t>
+            </w:r>
+          </w:p>
+        </w:tc>
+        <w:tc>
+          <w:tcPr>
+            <w:tcW w:w="1993" w:type="dxa"/>
+            <w:tcBorders>
+              <w:left w:val="single" w:sz="4" w:space="0" w:color="000000"/>
+              <w:bottom w:val="single" w:sz="4" w:space="0" w:color="000000"/>
+            </w:tcBorders>
+          </w:tcPr>
+          <w:p>
+            <w:pPr>
+              <w:pStyle w:val="TableContents"/>
+              <w:widowControl w:val="false"/>
+              <w:rPr/>
+            </w:pPr>
+            <w:r>
+              <w:rPr/>
+              <w:t>Deasy alleged that the city of Louisville sewer district illegally created sewer construction subdistricts</w:t>
+            </w:r>
+          </w:p>
+        </w:tc>
+        <w:tc>
+          <w:tcPr>
+            <w:tcW w:w="1996" w:type="dxa"/>
+            <w:tcBorders>
+              <w:left w:val="single" w:sz="4" w:space="0" w:color="000000"/>
+              <w:bottom w:val="single" w:sz="4" w:space="0" w:color="000000"/>
+            </w:tcBorders>
+          </w:tcPr>
+          <w:p>
+            <w:pPr>
+              <w:pStyle w:val="TableContents"/>
+              <w:widowControl w:val="false"/>
+              <w:rPr/>
+            </w:pPr>
+            <w:r>
+              <w:rPr/>
+              <w:t>Pitt divorced Mary Lou, a decree gave her the farm, he kept living there anyway. Mary Lou filed to evict him, and John Pitt sued her. John also filed a lien the the farm and petitioned a Kentucky court to undo the divorce decree</w:t>
+            </w:r>
+          </w:p>
+        </w:tc>
+        <w:tc>
+          <w:tcPr>
+            <w:tcW w:w="1993" w:type="dxa"/>
+            <w:tcBorders>
+              <w:left w:val="single" w:sz="4" w:space="0" w:color="000000"/>
+              <w:bottom w:val="single" w:sz="4" w:space="0" w:color="000000"/>
+            </w:tcBorders>
+          </w:tcPr>
+          <w:p>
+            <w:pPr>
+              <w:pStyle w:val="TableContents"/>
+              <w:widowControl w:val="false"/>
+              <w:rPr/>
+            </w:pPr>
+            <w:r>
+              <w:rPr/>
+              <w:t>Not said</w:t>
+            </w:r>
+          </w:p>
+        </w:tc>
+        <w:tc>
+          <w:tcPr>
+            <w:tcW w:w="1996" w:type="dxa"/>
+            <w:tcBorders>
+              <w:left w:val="single" w:sz="4" w:space="0" w:color="000000"/>
+              <w:bottom w:val="single" w:sz="4" w:space="0" w:color="000000"/>
+              <w:right w:val="single" w:sz="4" w:space="0" w:color="000000"/>
+            </w:tcBorders>
+          </w:tcPr>
+          <w:p>
+            <w:pPr>
+              <w:pStyle w:val="TableContents"/>
+              <w:widowControl w:val="false"/>
+              <w:rPr/>
+            </w:pPr>
+            <w:r>
+              <w:rPr/>
+              <w:t>Not said</w:t>
+            </w:r>
+          </w:p>
+        </w:tc>
+      </w:tr>
+      <w:tr>
+        <w:trPr/>
+        <w:tc>
+          <w:tcPr>
+            <w:tcW w:w="1994" w:type="dxa"/>
+            <w:tcBorders>
+              <w:left w:val="single" w:sz="4" w:space="0" w:color="000000"/>
+              <w:bottom w:val="single" w:sz="4" w:space="0" w:color="000000"/>
+            </w:tcBorders>
+          </w:tcPr>
+          <w:p>
+            <w:pPr>
+              <w:pStyle w:val="TableContents"/>
+              <w:widowControl w:val="false"/>
+              <w:rPr/>
+            </w:pPr>
+            <w:r>
+              <w:rPr/>
+              <w:t>Where the case started</w:t>
+            </w:r>
+          </w:p>
+        </w:tc>
+        <w:tc>
+          <w:tcPr>
+            <w:tcW w:w="1993" w:type="dxa"/>
+            <w:tcBorders>
+              <w:left w:val="single" w:sz="4" w:space="0" w:color="000000"/>
+              <w:bottom w:val="single" w:sz="4" w:space="0" w:color="000000"/>
+            </w:tcBorders>
+          </w:tcPr>
+          <w:p>
+            <w:pPr>
+              <w:pStyle w:val="TableContents"/>
+              <w:widowControl w:val="false"/>
+              <w:rPr/>
+            </w:pPr>
+            <w:r>
+              <w:rPr/>
+              <w:t>Federal, W.D. Ky</w:t>
+            </w:r>
+          </w:p>
+        </w:tc>
+        <w:tc>
+          <w:tcPr>
+            <w:tcW w:w="1996" w:type="dxa"/>
+            <w:tcBorders>
+              <w:left w:val="single" w:sz="4" w:space="0" w:color="000000"/>
+              <w:bottom w:val="single" w:sz="4" w:space="0" w:color="000000"/>
+            </w:tcBorders>
+          </w:tcPr>
+          <w:p>
+            <w:pPr>
+              <w:pStyle w:val="TableContents"/>
+              <w:widowControl w:val="false"/>
+              <w:rPr/>
+            </w:pPr>
+            <w:r>
+              <w:rPr/>
+              <w:t>Federal, M.D. Tenn</w:t>
+            </w:r>
+          </w:p>
+        </w:tc>
+        <w:tc>
+          <w:tcPr>
+            <w:tcW w:w="1993" w:type="dxa"/>
+            <w:tcBorders>
+              <w:left w:val="single" w:sz="4" w:space="0" w:color="000000"/>
+              <w:bottom w:val="single" w:sz="4" w:space="0" w:color="000000"/>
+            </w:tcBorders>
+          </w:tcPr>
+          <w:p>
+            <w:pPr>
+              <w:pStyle w:val="TableContents"/>
+              <w:widowControl w:val="false"/>
+              <w:rPr/>
+            </w:pPr>
+            <w:r>
+              <w:rPr/>
+              <w:t>Kentucky state court</w:t>
+            </w:r>
+          </w:p>
+        </w:tc>
+        <w:tc>
+          <w:tcPr>
+            <w:tcW w:w="1996" w:type="dxa"/>
+            <w:tcBorders>
+              <w:left w:val="single" w:sz="4" w:space="0" w:color="000000"/>
+              <w:bottom w:val="single" w:sz="4" w:space="0" w:color="000000"/>
+              <w:right w:val="single" w:sz="4" w:space="0" w:color="000000"/>
+            </w:tcBorders>
+          </w:tcPr>
+          <w:p>
+            <w:pPr>
+              <w:pStyle w:val="TableContents"/>
+              <w:widowControl w:val="false"/>
+              <w:rPr/>
+            </w:pPr>
+            <w:r>
+              <w:rPr/>
+              <w:t>Tennessee state court, Davidson county</w:t>
+            </w:r>
+          </w:p>
+        </w:tc>
+      </w:tr>
+      <w:tr>
+        <w:trPr/>
+        <w:tc>
+          <w:tcPr>
+            <w:tcW w:w="1994" w:type="dxa"/>
+            <w:tcBorders>
+              <w:left w:val="single" w:sz="4" w:space="0" w:color="000000"/>
+              <w:bottom w:val="single" w:sz="4" w:space="0" w:color="000000"/>
+            </w:tcBorders>
+          </w:tcPr>
+          <w:p>
+            <w:pPr>
+              <w:pStyle w:val="TableContents"/>
+              <w:widowControl w:val="false"/>
+              <w:rPr/>
+            </w:pPr>
+            <w:r>
+              <w:rPr/>
+              <w:t>Who wanted the case moved</w:t>
+            </w:r>
+          </w:p>
+        </w:tc>
+        <w:tc>
+          <w:tcPr>
+            <w:tcW w:w="1993" w:type="dxa"/>
+            <w:tcBorders>
+              <w:left w:val="single" w:sz="4" w:space="0" w:color="000000"/>
+              <w:bottom w:val="single" w:sz="4" w:space="0" w:color="000000"/>
+            </w:tcBorders>
+          </w:tcPr>
+          <w:p>
+            <w:pPr>
+              <w:pStyle w:val="TableContents"/>
+              <w:widowControl w:val="false"/>
+              <w:rPr/>
+            </w:pPr>
+            <w:r>
+              <w:rPr/>
+              <w:t>Plaintiff chose federal court, defendants moved to dismiss</w:t>
+            </w:r>
+          </w:p>
+        </w:tc>
+        <w:tc>
+          <w:tcPr>
+            <w:tcW w:w="1996" w:type="dxa"/>
+            <w:tcBorders>
+              <w:left w:val="single" w:sz="4" w:space="0" w:color="000000"/>
+              <w:bottom w:val="single" w:sz="4" w:space="0" w:color="000000"/>
+            </w:tcBorders>
+          </w:tcPr>
+          <w:p>
+            <w:pPr>
+              <w:pStyle w:val="TableContents"/>
+              <w:widowControl w:val="false"/>
+              <w:rPr/>
+            </w:pPr>
+            <w:r>
+              <w:rPr/>
+              <w:t>Plaintiff chose federal, Mary Lou Pitt moved to dismiss</w:t>
+            </w:r>
+          </w:p>
+        </w:tc>
+        <w:tc>
+          <w:tcPr>
+            <w:tcW w:w="1993" w:type="dxa"/>
+            <w:tcBorders>
+              <w:left w:val="single" w:sz="4" w:space="0" w:color="000000"/>
+              <w:bottom w:val="single" w:sz="4" w:space="0" w:color="000000"/>
+            </w:tcBorders>
+          </w:tcPr>
+          <w:p>
+            <w:pPr>
+              <w:pStyle w:val="TableContents"/>
+              <w:widowControl w:val="false"/>
+              <w:rPr/>
+            </w:pPr>
+            <w:r>
+              <w:rPr/>
+              <w:t xml:space="preserve">State Farm (defendant) removed </w:t>
+            </w:r>
+          </w:p>
+        </w:tc>
+        <w:tc>
+          <w:tcPr>
+            <w:tcW w:w="1996" w:type="dxa"/>
+            <w:tcBorders>
+              <w:left w:val="single" w:sz="4" w:space="0" w:color="000000"/>
+              <w:bottom w:val="single" w:sz="4" w:space="0" w:color="000000"/>
+              <w:right w:val="single" w:sz="4" w:space="0" w:color="000000"/>
+            </w:tcBorders>
+          </w:tcPr>
+          <w:p>
+            <w:pPr>
+              <w:pStyle w:val="TableContents"/>
+              <w:widowControl w:val="false"/>
+              <w:rPr/>
+            </w:pPr>
+            <w:r>
+              <w:rPr/>
+              <w:t>Defendant removed to M.D. Tennessee</w:t>
+            </w:r>
+          </w:p>
+        </w:tc>
+      </w:tr>
+      <w:tr>
+        <w:trPr/>
+        <w:tc>
+          <w:tcPr>
+            <w:tcW w:w="1994" w:type="dxa"/>
+            <w:tcBorders>
+              <w:left w:val="single" w:sz="4" w:space="0" w:color="000000"/>
+              <w:bottom w:val="single" w:sz="4" w:space="0" w:color="000000"/>
+            </w:tcBorders>
+          </w:tcPr>
+          <w:p>
+            <w:pPr>
+              <w:pStyle w:val="TableContents"/>
+              <w:widowControl w:val="false"/>
+              <w:rPr/>
+            </w:pPr>
+            <w:r>
+              <w:rPr/>
+              <w:t>Who bore the burden</w:t>
+            </w:r>
+          </w:p>
+        </w:tc>
+        <w:tc>
+          <w:tcPr>
+            <w:tcW w:w="1993" w:type="dxa"/>
+            <w:tcBorders>
+              <w:left w:val="single" w:sz="4" w:space="0" w:color="000000"/>
+              <w:bottom w:val="single" w:sz="4" w:space="0" w:color="000000"/>
+            </w:tcBorders>
+          </w:tcPr>
+          <w:p>
+            <w:pPr>
+              <w:pStyle w:val="TableContents"/>
+              <w:widowControl w:val="false"/>
+              <w:rPr/>
+            </w:pPr>
+            <w:r>
+              <w:rPr/>
+              <w:t xml:space="preserve">Deasy </w:t>
+            </w:r>
+          </w:p>
+        </w:tc>
+        <w:tc>
+          <w:tcPr>
+            <w:tcW w:w="1996" w:type="dxa"/>
+            <w:tcBorders>
+              <w:left w:val="single" w:sz="4" w:space="0" w:color="000000"/>
+              <w:bottom w:val="single" w:sz="4" w:space="0" w:color="000000"/>
+            </w:tcBorders>
+          </w:tcPr>
+          <w:p>
+            <w:pPr>
+              <w:pStyle w:val="TableContents"/>
+              <w:widowControl w:val="false"/>
+              <w:rPr/>
+            </w:pPr>
+            <w:r>
+              <w:rPr/>
+              <w:t>Pitt Excavating</w:t>
+            </w:r>
+          </w:p>
+        </w:tc>
+        <w:tc>
+          <w:tcPr>
+            <w:tcW w:w="1993" w:type="dxa"/>
+            <w:tcBorders>
+              <w:left w:val="single" w:sz="4" w:space="0" w:color="000000"/>
+              <w:bottom w:val="single" w:sz="4" w:space="0" w:color="000000"/>
+            </w:tcBorders>
+          </w:tcPr>
+          <w:p>
+            <w:pPr>
+              <w:pStyle w:val="TableContents"/>
+              <w:widowControl w:val="false"/>
+              <w:rPr/>
+            </w:pPr>
+            <w:r>
+              <w:rPr/>
+              <w:t>State Farm</w:t>
+            </w:r>
+          </w:p>
+        </w:tc>
+        <w:tc>
+          <w:tcPr>
+            <w:tcW w:w="1996" w:type="dxa"/>
+            <w:tcBorders>
+              <w:left w:val="single" w:sz="4" w:space="0" w:color="000000"/>
+              <w:bottom w:val="single" w:sz="4" w:space="0" w:color="000000"/>
+              <w:right w:val="single" w:sz="4" w:space="0" w:color="000000"/>
+            </w:tcBorders>
+          </w:tcPr>
+          <w:p>
+            <w:pPr>
+              <w:pStyle w:val="TableContents"/>
+              <w:widowControl w:val="false"/>
+              <w:rPr/>
+            </w:pPr>
+            <w:r>
+              <w:rPr/>
+              <w:t>Tech company</w:t>
+            </w:r>
+          </w:p>
+        </w:tc>
+      </w:tr>
+      <w:tr>
+        <w:trPr/>
+        <w:tc>
+          <w:tcPr>
+            <w:tcW w:w="1994" w:type="dxa"/>
+            <w:tcBorders>
+              <w:left w:val="single" w:sz="4" w:space="0" w:color="000000"/>
+              <w:bottom w:val="single" w:sz="4" w:space="0" w:color="000000"/>
+            </w:tcBorders>
+          </w:tcPr>
+          <w:p>
+            <w:pPr>
+              <w:pStyle w:val="TableContents"/>
+              <w:widowControl w:val="false"/>
+              <w:rPr/>
+            </w:pPr>
+            <w:r>
+              <w:rPr/>
+              <w:t>Plaintiff Wanted</w:t>
+            </w:r>
+          </w:p>
+        </w:tc>
+        <w:tc>
+          <w:tcPr>
+            <w:tcW w:w="1993" w:type="dxa"/>
+            <w:tcBorders>
+              <w:left w:val="single" w:sz="4" w:space="0" w:color="000000"/>
+              <w:bottom w:val="single" w:sz="4" w:space="0" w:color="000000"/>
+            </w:tcBorders>
+          </w:tcPr>
+          <w:p>
+            <w:pPr>
+              <w:pStyle w:val="TableContents"/>
+              <w:widowControl w:val="false"/>
+              <w:rPr/>
+            </w:pPr>
+            <w:r>
+              <w:rPr/>
+              <w:t>Federal</w:t>
+            </w:r>
+          </w:p>
+        </w:tc>
+        <w:tc>
+          <w:tcPr>
+            <w:tcW w:w="1996" w:type="dxa"/>
+            <w:tcBorders>
+              <w:left w:val="single" w:sz="4" w:space="0" w:color="000000"/>
+              <w:bottom w:val="single" w:sz="4" w:space="0" w:color="000000"/>
+            </w:tcBorders>
+          </w:tcPr>
+          <w:p>
+            <w:pPr>
+              <w:pStyle w:val="TableContents"/>
+              <w:widowControl w:val="false"/>
+              <w:rPr/>
+            </w:pPr>
+            <w:r>
+              <w:rPr/>
+              <w:t>Federal</w:t>
+            </w:r>
+          </w:p>
+        </w:tc>
+        <w:tc>
+          <w:tcPr>
+            <w:tcW w:w="1993" w:type="dxa"/>
+            <w:tcBorders>
+              <w:left w:val="single" w:sz="4" w:space="0" w:color="000000"/>
+              <w:bottom w:val="single" w:sz="4" w:space="0" w:color="000000"/>
+            </w:tcBorders>
+          </w:tcPr>
+          <w:p>
+            <w:pPr>
+              <w:pStyle w:val="TableContents"/>
+              <w:widowControl w:val="false"/>
+              <w:rPr/>
+            </w:pPr>
+            <w:r>
+              <w:rPr/>
+              <w:t xml:space="preserve">State Court, never argued </w:t>
+            </w:r>
+          </w:p>
+        </w:tc>
+        <w:tc>
+          <w:tcPr>
+            <w:tcW w:w="1996" w:type="dxa"/>
+            <w:tcBorders>
+              <w:left w:val="single" w:sz="4" w:space="0" w:color="000000"/>
+              <w:bottom w:val="single" w:sz="4" w:space="0" w:color="000000"/>
+              <w:right w:val="single" w:sz="4" w:space="0" w:color="000000"/>
+            </w:tcBorders>
+          </w:tcPr>
+          <w:p>
+            <w:pPr>
+              <w:pStyle w:val="TableContents"/>
+              <w:widowControl w:val="false"/>
+              <w:rPr/>
+            </w:pPr>
+            <w:r>
+              <w:rPr/>
+              <w:t>State Court</w:t>
+            </w:r>
+          </w:p>
+        </w:tc>
+      </w:tr>
+      <w:tr>
+        <w:trPr/>
+        <w:tc>
+          <w:tcPr>
+            <w:tcW w:w="1994" w:type="dxa"/>
+            <w:tcBorders>
+              <w:left w:val="single" w:sz="4" w:space="0" w:color="000000"/>
+              <w:bottom w:val="single" w:sz="4" w:space="0" w:color="000000"/>
+            </w:tcBorders>
+          </w:tcPr>
+          <w:p>
+            <w:pPr>
+              <w:pStyle w:val="TableContents"/>
+              <w:widowControl w:val="false"/>
+              <w:rPr/>
+            </w:pPr>
+            <w:r>
+              <w:rPr/>
+              <w:t>Defendant Wanted</w:t>
+            </w:r>
+          </w:p>
+        </w:tc>
+        <w:tc>
+          <w:tcPr>
+            <w:tcW w:w="1993" w:type="dxa"/>
+            <w:tcBorders>
+              <w:left w:val="single" w:sz="4" w:space="0" w:color="000000"/>
+              <w:bottom w:val="single" w:sz="4" w:space="0" w:color="000000"/>
+            </w:tcBorders>
+          </w:tcPr>
+          <w:p>
+            <w:pPr>
+              <w:pStyle w:val="TableContents"/>
+              <w:widowControl w:val="false"/>
+              <w:rPr/>
+            </w:pPr>
+            <w:r>
+              <w:rPr/>
+              <w:t>Dismissed from federal court</w:t>
+            </w:r>
+          </w:p>
+        </w:tc>
+        <w:tc>
+          <w:tcPr>
+            <w:tcW w:w="1996" w:type="dxa"/>
+            <w:tcBorders>
+              <w:left w:val="single" w:sz="4" w:space="0" w:color="000000"/>
+              <w:bottom w:val="single" w:sz="4" w:space="0" w:color="000000"/>
+            </w:tcBorders>
+          </w:tcPr>
+          <w:p>
+            <w:pPr>
+              <w:pStyle w:val="TableContents"/>
+              <w:widowControl w:val="false"/>
+              <w:rPr/>
+            </w:pPr>
+            <w:r>
+              <w:rPr/>
+              <w:t>Dismissed from federal court</w:t>
+            </w:r>
+          </w:p>
+        </w:tc>
+        <w:tc>
+          <w:tcPr>
+            <w:tcW w:w="1993" w:type="dxa"/>
+            <w:tcBorders>
+              <w:left w:val="single" w:sz="4" w:space="0" w:color="000000"/>
+              <w:bottom w:val="single" w:sz="4" w:space="0" w:color="000000"/>
+            </w:tcBorders>
+          </w:tcPr>
+          <w:p>
+            <w:pPr>
+              <w:pStyle w:val="TableContents"/>
+              <w:widowControl w:val="false"/>
+              <w:rPr/>
+            </w:pPr>
+            <w:r>
+              <w:rPr/>
+              <w:t>Federal Court</w:t>
+            </w:r>
+          </w:p>
+        </w:tc>
+        <w:tc>
+          <w:tcPr>
+            <w:tcW w:w="1996" w:type="dxa"/>
+            <w:tcBorders>
+              <w:left w:val="single" w:sz="4" w:space="0" w:color="000000"/>
+              <w:bottom w:val="single" w:sz="4" w:space="0" w:color="000000"/>
+              <w:right w:val="single" w:sz="4" w:space="0" w:color="000000"/>
+            </w:tcBorders>
+          </w:tcPr>
+          <w:p>
+            <w:pPr>
+              <w:pStyle w:val="TableContents"/>
+              <w:widowControl w:val="false"/>
+              <w:rPr/>
+            </w:pPr>
+            <w:r>
+              <w:rPr/>
+              <w:t>Federal Court</w:t>
+            </w:r>
+          </w:p>
+        </w:tc>
+      </w:tr>
+      <w:tr>
+        <w:trPr/>
+        <w:tc>
+          <w:tcPr>
+            <w:tcW w:w="1994" w:type="dxa"/>
+            <w:tcBorders>
+              <w:left w:val="single" w:sz="4" w:space="0" w:color="000000"/>
+              <w:bottom w:val="single" w:sz="4" w:space="0" w:color="000000"/>
+            </w:tcBorders>
+          </w:tcPr>
+          <w:p>
+            <w:pPr>
+              <w:pStyle w:val="TableContents"/>
+              <w:widowControl w:val="false"/>
+              <w:rPr/>
+            </w:pPr>
+            <w:r>
+              <w:rPr/>
+              <w:t>Whose domicile was at issue</w:t>
+            </w:r>
+          </w:p>
+        </w:tc>
+        <w:tc>
+          <w:tcPr>
+            <w:tcW w:w="1993" w:type="dxa"/>
+            <w:tcBorders>
+              <w:left w:val="single" w:sz="4" w:space="0" w:color="000000"/>
+              <w:bottom w:val="single" w:sz="4" w:space="0" w:color="000000"/>
+            </w:tcBorders>
+          </w:tcPr>
+          <w:p>
+            <w:pPr>
+              <w:pStyle w:val="TableContents"/>
+              <w:widowControl w:val="false"/>
+              <w:rPr/>
+            </w:pPr>
+            <w:r>
+              <w:rPr/>
+              <w:t>Deasy</w:t>
+            </w:r>
+          </w:p>
+        </w:tc>
+        <w:tc>
+          <w:tcPr>
+            <w:tcW w:w="1996" w:type="dxa"/>
+            <w:tcBorders>
+              <w:left w:val="single" w:sz="4" w:space="0" w:color="000000"/>
+              <w:bottom w:val="single" w:sz="4" w:space="0" w:color="000000"/>
+            </w:tcBorders>
+          </w:tcPr>
+          <w:p>
+            <w:pPr>
+              <w:pStyle w:val="TableContents"/>
+              <w:widowControl w:val="false"/>
+              <w:rPr/>
+            </w:pPr>
+            <w:r>
+              <w:rPr/>
+              <w:t>John Pitt</w:t>
+            </w:r>
+          </w:p>
+        </w:tc>
+        <w:tc>
+          <w:tcPr>
+            <w:tcW w:w="1993" w:type="dxa"/>
+            <w:tcBorders>
+              <w:left w:val="single" w:sz="4" w:space="0" w:color="000000"/>
+              <w:bottom w:val="single" w:sz="4" w:space="0" w:color="000000"/>
+            </w:tcBorders>
+          </w:tcPr>
+          <w:p>
+            <w:pPr>
+              <w:pStyle w:val="TableContents"/>
+              <w:widowControl w:val="false"/>
+              <w:rPr/>
+            </w:pPr>
+            <w:r>
+              <w:rPr/>
+              <w:t>Emmons</w:t>
+            </w:r>
+          </w:p>
+        </w:tc>
+        <w:tc>
+          <w:tcPr>
+            <w:tcW w:w="1996" w:type="dxa"/>
+            <w:tcBorders>
+              <w:left w:val="single" w:sz="4" w:space="0" w:color="000000"/>
+              <w:bottom w:val="single" w:sz="4" w:space="0" w:color="000000"/>
+              <w:right w:val="single" w:sz="4" w:space="0" w:color="000000"/>
+            </w:tcBorders>
+          </w:tcPr>
+          <w:p>
+            <w:pPr>
+              <w:pStyle w:val="TableContents"/>
+              <w:widowControl w:val="false"/>
+              <w:rPr/>
+            </w:pPr>
+            <w:r>
+              <w:rPr/>
+              <w:t>Fox</w:t>
+            </w:r>
+          </w:p>
+        </w:tc>
+      </w:tr>
+      <w:tr>
+        <w:trPr/>
+        <w:tc>
+          <w:tcPr>
+            <w:tcW w:w="1994" w:type="dxa"/>
+            <w:tcBorders>
+              <w:left w:val="single" w:sz="4" w:space="0" w:color="000000"/>
+              <w:bottom w:val="single" w:sz="4" w:space="0" w:color="000000"/>
+            </w:tcBorders>
+          </w:tcPr>
+          <w:p>
+            <w:pPr>
+              <w:pStyle w:val="TableContents"/>
+              <w:widowControl w:val="false"/>
+              <w:rPr/>
+            </w:pPr>
+            <w:r>
+              <w:rPr/>
+              <w:t>Housing in the claimed state</w:t>
+            </w:r>
+          </w:p>
+        </w:tc>
+        <w:tc>
+          <w:tcPr>
+            <w:tcW w:w="1993" w:type="dxa"/>
+            <w:tcBorders>
+              <w:left w:val="single" w:sz="4" w:space="0" w:color="000000"/>
+              <w:bottom w:val="single" w:sz="4" w:space="0" w:color="000000"/>
+            </w:tcBorders>
+          </w:tcPr>
+          <w:p>
+            <w:pPr>
+              <w:pStyle w:val="TableContents"/>
+              <w:widowControl w:val="false"/>
+              <w:rPr/>
+            </w:pPr>
+            <w:r>
+              <w:rPr/>
+              <w:t xml:space="preserve">Tennessee, half of his sister’s duplex, owned and inherited home but rented it out </w:t>
+            </w:r>
+          </w:p>
+        </w:tc>
+        <w:tc>
+          <w:tcPr>
+            <w:tcW w:w="1996" w:type="dxa"/>
+            <w:tcBorders>
+              <w:left w:val="single" w:sz="4" w:space="0" w:color="000000"/>
+              <w:bottom w:val="single" w:sz="4" w:space="0" w:color="000000"/>
+            </w:tcBorders>
+          </w:tcPr>
+          <w:p>
+            <w:pPr>
+              <w:pStyle w:val="TableContents"/>
+              <w:widowControl w:val="false"/>
+              <w:rPr/>
+            </w:pPr>
+            <w:r>
+              <w:rPr/>
+              <w:t>Tennessee, leased apartment in Madison</w:t>
+            </w:r>
+          </w:p>
+        </w:tc>
+        <w:tc>
+          <w:tcPr>
+            <w:tcW w:w="1993" w:type="dxa"/>
+            <w:tcBorders>
+              <w:left w:val="single" w:sz="4" w:space="0" w:color="000000"/>
+              <w:bottom w:val="single" w:sz="4" w:space="0" w:color="000000"/>
+            </w:tcBorders>
+          </w:tcPr>
+          <w:p>
+            <w:pPr>
+              <w:pStyle w:val="TableContents"/>
+              <w:widowControl w:val="false"/>
+              <w:rPr/>
+            </w:pPr>
+            <w:r>
+              <w:rPr/>
+              <w:t>Michigan, 13 straight years of Michigan addresses</w:t>
+            </w:r>
+          </w:p>
+        </w:tc>
+        <w:tc>
+          <w:tcPr>
+            <w:tcW w:w="1996" w:type="dxa"/>
+            <w:tcBorders>
+              <w:left w:val="single" w:sz="4" w:space="0" w:color="000000"/>
+              <w:bottom w:val="single" w:sz="4" w:space="0" w:color="000000"/>
+              <w:right w:val="single" w:sz="4" w:space="0" w:color="000000"/>
+            </w:tcBorders>
+          </w:tcPr>
+          <w:p>
+            <w:pPr>
+              <w:pStyle w:val="TableContents"/>
+              <w:widowControl w:val="false"/>
+              <w:rPr/>
+            </w:pPr>
+            <w:r>
+              <w:rPr/>
+              <w:t>Tennessee, leased apartment for three years</w:t>
+            </w:r>
+          </w:p>
+        </w:tc>
+      </w:tr>
+      <w:tr>
+        <w:trPr/>
+        <w:tc>
+          <w:tcPr>
+            <w:tcW w:w="1994" w:type="dxa"/>
+            <w:tcBorders>
+              <w:left w:val="single" w:sz="4" w:space="0" w:color="000000"/>
+              <w:bottom w:val="single" w:sz="4" w:space="0" w:color="000000"/>
+            </w:tcBorders>
+          </w:tcPr>
+          <w:p>
+            <w:pPr>
+              <w:pStyle w:val="TableContents"/>
+              <w:widowControl w:val="false"/>
+              <w:rPr/>
+            </w:pPr>
+            <w:r>
+              <w:rPr/>
+              <w:t>Housing in the state asserted against</w:t>
+            </w:r>
+          </w:p>
+        </w:tc>
+        <w:tc>
+          <w:tcPr>
+            <w:tcW w:w="1993" w:type="dxa"/>
+            <w:tcBorders>
+              <w:left w:val="single" w:sz="4" w:space="0" w:color="000000"/>
+              <w:bottom w:val="single" w:sz="4" w:space="0" w:color="000000"/>
+            </w:tcBorders>
+          </w:tcPr>
+          <w:p>
+            <w:pPr>
+              <w:pStyle w:val="TableContents"/>
+              <w:widowControl w:val="false"/>
+              <w:rPr/>
+            </w:pPr>
+            <w:r>
+              <w:rPr/>
+              <w:t xml:space="preserve">Kentucky, owned the home he lived in </w:t>
+            </w:r>
+          </w:p>
+        </w:tc>
+        <w:tc>
+          <w:tcPr>
+            <w:tcW w:w="1996" w:type="dxa"/>
+            <w:tcBorders>
+              <w:left w:val="single" w:sz="4" w:space="0" w:color="000000"/>
+              <w:bottom w:val="single" w:sz="4" w:space="0" w:color="000000"/>
+            </w:tcBorders>
+          </w:tcPr>
+          <w:p>
+            <w:pPr>
+              <w:pStyle w:val="TableContents"/>
+              <w:widowControl w:val="false"/>
+              <w:rPr/>
+            </w:pPr>
+            <w:r>
+              <w:rPr/>
+              <w:t>Kentucky, farm he lived at but awarded to his ex-wife</w:t>
+            </w:r>
+          </w:p>
+        </w:tc>
+        <w:tc>
+          <w:tcPr>
+            <w:tcW w:w="1993" w:type="dxa"/>
+            <w:tcBorders>
+              <w:left w:val="single" w:sz="4" w:space="0" w:color="000000"/>
+              <w:bottom w:val="single" w:sz="4" w:space="0" w:color="000000"/>
+            </w:tcBorders>
+          </w:tcPr>
+          <w:p>
+            <w:pPr>
+              <w:pStyle w:val="TableContents"/>
+              <w:widowControl w:val="false"/>
+              <w:rPr/>
+            </w:pPr>
+            <w:r>
+              <w:rPr/>
+              <w:t>Kentucky, one 6 month address</w:t>
+            </w:r>
+          </w:p>
+        </w:tc>
+        <w:tc>
+          <w:tcPr>
+            <w:tcW w:w="1996" w:type="dxa"/>
+            <w:tcBorders>
+              <w:left w:val="single" w:sz="4" w:space="0" w:color="000000"/>
+              <w:bottom w:val="single" w:sz="4" w:space="0" w:color="000000"/>
+              <w:right w:val="single" w:sz="4" w:space="0" w:color="000000"/>
+            </w:tcBorders>
+          </w:tcPr>
+          <w:p>
+            <w:pPr>
+              <w:pStyle w:val="TableContents"/>
+              <w:widowControl w:val="false"/>
+              <w:rPr/>
+            </w:pPr>
+            <w:r>
+              <w:rPr/>
+              <w:t>Kentucky, owns the land and built a ranch home</w:t>
+            </w:r>
+          </w:p>
+        </w:tc>
+      </w:tr>
+      <w:tr>
+        <w:trPr/>
+        <w:tc>
+          <w:tcPr>
+            <w:tcW w:w="1994" w:type="dxa"/>
+            <w:tcBorders>
+              <w:left w:val="single" w:sz="4" w:space="0" w:color="000000"/>
+              <w:bottom w:val="single" w:sz="4" w:space="0" w:color="000000"/>
+            </w:tcBorders>
+          </w:tcPr>
+          <w:p>
+            <w:pPr>
+              <w:pStyle w:val="TableContents"/>
+              <w:widowControl w:val="false"/>
+              <w:rPr/>
+            </w:pPr>
+            <w:r>
+              <w:rPr/>
+              <w:t>Outcome</w:t>
+            </w:r>
+          </w:p>
+        </w:tc>
+        <w:tc>
+          <w:tcPr>
+            <w:tcW w:w="1993" w:type="dxa"/>
+            <w:tcBorders>
+              <w:left w:val="single" w:sz="4" w:space="0" w:color="000000"/>
+              <w:bottom w:val="single" w:sz="4" w:space="0" w:color="000000"/>
+            </w:tcBorders>
+          </w:tcPr>
+          <w:p>
+            <w:pPr>
+              <w:pStyle w:val="TableContents"/>
+              <w:widowControl w:val="false"/>
+              <w:rPr/>
+            </w:pPr>
+            <w:r>
+              <w:rPr/>
+              <w:t>Deasy was a Kentucky citizen</w:t>
+            </w:r>
+          </w:p>
+        </w:tc>
+        <w:tc>
+          <w:tcPr>
+            <w:tcW w:w="1996" w:type="dxa"/>
+            <w:tcBorders>
+              <w:left w:val="single" w:sz="4" w:space="0" w:color="000000"/>
+              <w:bottom w:val="single" w:sz="4" w:space="0" w:color="000000"/>
+            </w:tcBorders>
+          </w:tcPr>
+          <w:p>
+            <w:pPr>
+              <w:pStyle w:val="TableContents"/>
+              <w:widowControl w:val="false"/>
+              <w:rPr/>
+            </w:pPr>
+            <w:r>
+              <w:rPr/>
+              <w:t>Pitt was a Kentucky citizen</w:t>
+            </w:r>
+          </w:p>
+        </w:tc>
+        <w:tc>
+          <w:tcPr>
+            <w:tcW w:w="1993" w:type="dxa"/>
+            <w:tcBorders>
+              <w:left w:val="single" w:sz="4" w:space="0" w:color="000000"/>
+              <w:bottom w:val="single" w:sz="4" w:space="0" w:color="000000"/>
+            </w:tcBorders>
+          </w:tcPr>
+          <w:p>
+            <w:pPr>
+              <w:pStyle w:val="TableContents"/>
+              <w:widowControl w:val="false"/>
+              <w:rPr/>
+            </w:pPr>
+            <w:r>
+              <w:rPr/>
+              <w:t>Emmons was a Michigan citizen alone</w:t>
+            </w:r>
+          </w:p>
+        </w:tc>
+        <w:tc>
+          <w:tcPr>
+            <w:tcW w:w="1996" w:type="dxa"/>
+            <w:tcBorders>
+              <w:left w:val="single" w:sz="4" w:space="0" w:color="000000"/>
+              <w:bottom w:val="single" w:sz="4" w:space="0" w:color="000000"/>
+              <w:right w:val="single" w:sz="4" w:space="0" w:color="000000"/>
+            </w:tcBorders>
+          </w:tcPr>
+          <w:p>
+            <w:pPr>
+              <w:pStyle w:val="TableContents"/>
+              <w:widowControl w:val="false"/>
+              <w:rPr/>
+            </w:pPr>
+            <w:r>
+              <w:rPr/>
+            </w:r>
+          </w:p>
+        </w:tc>
+      </w:tr>
+    </w:tbl>
+    <w:p>
+      <w:pPr>
+        <w:pStyle w:val="Normal"/>
+        <w:bidi w:val="0"/>
+        <w:jc w:val="left"/>
+        <w:rPr>
+          <w:b w:val="false"/>
+          <w:b w:val="false"/>
+          <w:bCs w:val="false"/>
+        </w:rPr>
+      </w:pPr>
+      <w:r>
+        <w:rPr>
+          <w:b w:val="false"/>
+          <w:bCs w:val="false"/>
+        </w:rPr>
+      </w:r>
+    </w:p>
+    <w:p>
+      <w:pPr>
+        <w:pStyle w:val="Normal"/>
+        <w:bidi w:val="0"/>
+        <w:jc w:val="left"/>
+        <w:rPr>
+          <w:b w:val="false"/>
+          <w:b w:val="false"/>
+          <w:bCs w:val="false"/>
+        </w:rPr>
+      </w:pPr>
+      <w:r>
+        <w:rPr>
+          <w:b w:val="false"/>
+          <w:bCs w:val="false"/>
+        </w:rPr>
+        <w:t>Timeline</w:t>
+      </w:r>
+    </w:p>
+    <w:p>
+      <w:pPr>
+        <w:pStyle w:val="Normal"/>
+        <w:bidi w:val="0"/>
+        <w:jc w:val="left"/>
+        <w:rPr>
+          <w:b w:val="false"/>
+          <w:b w:val="false"/>
+          <w:bCs w:val="false"/>
+        </w:rPr>
+      </w:pPr>
+      <w:r>
+        <w:rPr>
+          <w:b w:val="false"/>
+          <w:bCs w:val="false"/>
+        </w:rPr>
+        <w:t>2019: Moves to Knoxville, TN for University</w:t>
+      </w:r>
+    </w:p>
+    <w:p>
+      <w:pPr>
+        <w:pStyle w:val="Normal"/>
+        <w:bidi w:val="0"/>
+        <w:jc w:val="left"/>
+        <w:rPr>
+          <w:b w:val="false"/>
+          <w:b w:val="false"/>
+          <w:bCs w:val="false"/>
+        </w:rPr>
+      </w:pPr>
+      <w:r>
+        <w:rPr>
+          <w:b w:val="false"/>
+          <w:bCs w:val="false"/>
+        </w:rPr>
+        <w:t>2020: Registers car in Tennessee, changes driver’s license to Tennessee</w:t>
+      </w:r>
+    </w:p>
+    <w:p>
+      <w:pPr>
+        <w:pStyle w:val="Normal"/>
+        <w:bidi w:val="0"/>
+        <w:jc w:val="left"/>
+        <w:rPr>
+          <w:b w:val="false"/>
+          <w:b w:val="false"/>
+          <w:bCs w:val="false"/>
+        </w:rPr>
+      </w:pPr>
+      <w:r>
+        <w:rPr>
+          <w:b w:val="false"/>
+          <w:bCs w:val="false"/>
+        </w:rPr>
+        <w:t>2023: Graduates, moves to Nashville, leases 118 Shelby Ave</w:t>
+      </w:r>
+    </w:p>
+    <w:p>
+      <w:pPr>
+        <w:pStyle w:val="Normal"/>
+        <w:bidi w:val="0"/>
+        <w:jc w:val="left"/>
+        <w:rPr>
+          <w:b w:val="false"/>
+          <w:b w:val="false"/>
+          <w:bCs w:val="false"/>
+        </w:rPr>
+      </w:pPr>
+      <w:r>
+        <w:rPr>
+          <w:b w:val="false"/>
+          <w:bCs w:val="false"/>
+        </w:rPr>
+        <w:t>Aug 18, 2023: Registers to vote in Davidson County</w:t>
+      </w:r>
+    </w:p>
+    <w:p>
+      <w:pPr>
+        <w:pStyle w:val="Normal"/>
+        <w:bidi w:val="0"/>
+        <w:jc w:val="left"/>
+        <w:rPr>
+          <w:b w:val="false"/>
+          <w:b w:val="false"/>
+          <w:bCs w:val="false"/>
+        </w:rPr>
+      </w:pPr>
+      <w:r>
+        <w:rPr>
+          <w:b w:val="false"/>
+          <w:bCs w:val="false"/>
+        </w:rPr>
+        <w:t>2024: Buys land near Bowling Green</w:t>
+      </w:r>
+    </w:p>
+    <w:p>
+      <w:pPr>
+        <w:pStyle w:val="Normal"/>
+        <w:bidi w:val="0"/>
+        <w:jc w:val="left"/>
+        <w:rPr>
+          <w:b w:val="false"/>
+          <w:b w:val="false"/>
+          <w:bCs w:val="false"/>
+        </w:rPr>
+      </w:pPr>
+      <w:r>
+        <w:rPr>
+          <w:b w:val="false"/>
+          <w:bCs w:val="false"/>
+        </w:rPr>
+        <w:t>August 1 2024: Votes in State Primary</w:t>
+      </w:r>
+    </w:p>
+    <w:p>
+      <w:pPr>
+        <w:pStyle w:val="Normal"/>
+        <w:bidi w:val="0"/>
+        <w:jc w:val="left"/>
+        <w:rPr>
+          <w:b w:val="false"/>
+          <w:b w:val="false"/>
+          <w:bCs w:val="false"/>
+        </w:rPr>
+      </w:pPr>
+      <w:r>
+        <w:rPr>
+          <w:b w:val="false"/>
+          <w:bCs w:val="false"/>
+        </w:rPr>
+        <w:t>November 5, 2024: Votes in General election</w:t>
+      </w:r>
+    </w:p>
+    <w:p>
+      <w:pPr>
+        <w:pStyle w:val="Normal"/>
+        <w:bidi w:val="0"/>
+        <w:jc w:val="left"/>
+        <w:rPr>
+          <w:b w:val="false"/>
+          <w:b w:val="false"/>
+          <w:bCs w:val="false"/>
+        </w:rPr>
+      </w:pPr>
+      <w:r>
+        <w:rPr>
+          <w:b w:val="false"/>
+          <w:bCs w:val="false"/>
+        </w:rPr>
+        <w:t>Feb 2026: Bowling Green house completed</w:t>
+      </w:r>
+    </w:p>
+    <w:p>
+      <w:pPr>
+        <w:pStyle w:val="Normal"/>
+        <w:bidi w:val="0"/>
+        <w:jc w:val="left"/>
+        <w:rPr>
+          <w:b w:val="false"/>
+          <w:b w:val="false"/>
+          <w:bCs w:val="false"/>
+        </w:rPr>
+      </w:pPr>
+      <w:r>
+        <w:rPr>
+          <w:b w:val="false"/>
+          <w:bCs w:val="false"/>
+        </w:rPr>
+        <w:t>March 2026: Starts electric, water, and internet to the KY House</w:t>
+      </w:r>
+    </w:p>
+    <w:p>
+      <w:pPr>
+        <w:pStyle w:val="Normal"/>
+        <w:bidi w:val="0"/>
+        <w:jc w:val="left"/>
+        <w:rPr>
+          <w:b w:val="false"/>
+          <w:b w:val="false"/>
+          <w:bCs w:val="false"/>
+        </w:rPr>
+      </w:pPr>
+      <w:r>
+        <w:rPr>
+          <w:b w:val="false"/>
+          <w:bCs w:val="false"/>
+        </w:rPr>
+        <w:t>June 5-9, 2026: Music City Pro Audio invoice, billed to Nashville address, shipped to Kentucky address</w:t>
+      </w:r>
+    </w:p>
+    <w:p>
+      <w:pPr>
+        <w:pStyle w:val="Normal"/>
+        <w:bidi w:val="0"/>
+        <w:jc w:val="left"/>
+        <w:rPr>
+          <w:b w:val="false"/>
+          <w:b w:val="false"/>
+          <w:bCs w:val="false"/>
+        </w:rPr>
+      </w:pPr>
+      <w:r>
+        <w:rPr>
+          <w:b w:val="false"/>
+          <w:bCs w:val="false"/>
+        </w:rPr>
+        <w:t>June 10, 2026: Warren County dog license issued, certified from East Nashville Veterinary clinic</w:t>
+      </w:r>
+    </w:p>
+    <w:p>
+      <w:pPr>
+        <w:pStyle w:val="Normal"/>
+        <w:bidi w:val="0"/>
+        <w:jc w:val="left"/>
+        <w:rPr>
+          <w:b w:val="false"/>
+          <w:b w:val="false"/>
+          <w:bCs w:val="false"/>
+        </w:rPr>
+      </w:pPr>
+      <w:r>
+        <w:rPr>
+          <w:b w:val="false"/>
+          <w:bCs w:val="false"/>
+        </w:rPr>
+        <w:t>June 19, 2026: Blue Anchor Room show in Nashville, Fox promoted as Kentucky’s ownership</w:t>
+      </w:r>
+    </w:p>
+    <w:p>
+      <w:pPr>
+        <w:pStyle w:val="Normal"/>
+        <w:bidi w:val="0"/>
+        <w:jc w:val="left"/>
+        <w:rPr>
+          <w:b w:val="false"/>
+          <w:b w:val="false"/>
+          <w:bCs w:val="false"/>
+        </w:rPr>
+      </w:pPr>
+      <w:r>
+        <w:rPr>
+          <w:b w:val="false"/>
+          <w:bCs w:val="false"/>
+        </w:rPr>
+        <w:t xml:space="preserve">Summer 2026: Furniture brought to house, spends 1-2 nights a week there and holidays </w:t>
+      </w:r>
+    </w:p>
+    <w:p>
+      <w:pPr>
+        <w:pStyle w:val="Normal"/>
+        <w:bidi w:val="0"/>
+        <w:jc w:val="left"/>
+        <w:rPr>
+          <w:b w:val="false"/>
+          <w:b w:val="false"/>
+          <w:bCs w:val="false"/>
+        </w:rPr>
+      </w:pPr>
+      <w:r>
+        <w:rPr>
+          <w:b w:val="false"/>
+          <w:bCs w:val="false"/>
+        </w:rPr>
+        <w:t>July 2026: Files suit in Davidson County, defendant removes case</w:t>
       </w:r>
     </w:p>
     <w:sectPr>
@@ -876,6 +3416,7 @@
       <w:pgNumType w:fmt="decimal"/>
       <w:formProt w:val="false"/>
       <w:textDirection w:val="lrTb"/>
+      <w:docGrid w:type="default" w:linePitch="100" w:charSpace="0"/>
     </w:sectPr>
   </w:body>
 </w:document>
@@ -2117,6 +4658,1376 @@
     </w:lvl>
   </w:abstractNum>
   <w:abstractNum w:abstractNumId="10">
+    <w:lvl w:ilvl="0">
+      <w:start w:val="1"/>
+      <w:numFmt w:val="bullet"/>
+      <w:lvlText w:val=""/>
+      <w:lvlJc w:val="left"/>
+      <w:pPr>
+        <w:tabs>
+          <w:tab w:val="num" w:pos="720"/>
+        </w:tabs>
+        <w:ind w:left="720" w:hanging="360"/>
+      </w:pPr>
+      <w:rPr>
+        <w:rFonts w:ascii="Symbol" w:hAnsi="Symbol" w:cs="Symbol" w:hint="default"/>
+      </w:rPr>
+    </w:lvl>
+    <w:lvl w:ilvl="1">
+      <w:start w:val="1"/>
+      <w:numFmt w:val="bullet"/>
+      <w:lvlText w:val="◦"/>
+      <w:lvlJc w:val="left"/>
+      <w:pPr>
+        <w:tabs>
+          <w:tab w:val="num" w:pos="1080"/>
+        </w:tabs>
+        <w:ind w:left="1080" w:hanging="360"/>
+      </w:pPr>
+      <w:rPr>
+        <w:rFonts w:ascii="OpenSymbol" w:hAnsi="OpenSymbol" w:cs="OpenSymbol" w:hint="default"/>
+      </w:rPr>
+    </w:lvl>
+    <w:lvl w:ilvl="2">
+      <w:start w:val="1"/>
+      <w:numFmt w:val="bullet"/>
+      <w:lvlText w:val="▪"/>
+      <w:lvlJc w:val="left"/>
+      <w:pPr>
+        <w:tabs>
+          <w:tab w:val="num" w:pos="1440"/>
+        </w:tabs>
+        <w:ind w:left="1440" w:hanging="360"/>
+      </w:pPr>
+      <w:rPr>
+        <w:rFonts w:ascii="OpenSymbol" w:hAnsi="OpenSymbol" w:cs="OpenSymbol" w:hint="default"/>
+      </w:rPr>
+    </w:lvl>
+    <w:lvl w:ilvl="3">
+      <w:start w:val="1"/>
+      <w:numFmt w:val="bullet"/>
+      <w:lvlText w:val=""/>
+      <w:lvlJc w:val="left"/>
+      <w:pPr>
+        <w:tabs>
+          <w:tab w:val="num" w:pos="1800"/>
+        </w:tabs>
+        <w:ind w:left="1800" w:hanging="360"/>
+      </w:pPr>
+      <w:rPr>
+        <w:rFonts w:ascii="Symbol" w:hAnsi="Symbol" w:cs="Symbol" w:hint="default"/>
+      </w:rPr>
+    </w:lvl>
+    <w:lvl w:ilvl="4">
+      <w:start w:val="1"/>
+      <w:numFmt w:val="bullet"/>
+      <w:lvlText w:val="◦"/>
+      <w:lvlJc w:val="left"/>
+      <w:pPr>
+        <w:tabs>
+          <w:tab w:val="num" w:pos="2160"/>
+        </w:tabs>
+        <w:ind w:left="2160" w:hanging="360"/>
+      </w:pPr>
+      <w:rPr>
+        <w:rFonts w:ascii="OpenSymbol" w:hAnsi="OpenSymbol" w:cs="OpenSymbol" w:hint="default"/>
+      </w:rPr>
+    </w:lvl>
+    <w:lvl w:ilvl="5">
+      <w:start w:val="1"/>
+      <w:numFmt w:val="bullet"/>
+      <w:lvlText w:val="▪"/>
+      <w:lvlJc w:val="left"/>
+      <w:pPr>
+        <w:tabs>
+          <w:tab w:val="num" w:pos="2520"/>
+        </w:tabs>
+        <w:ind w:left="2520" w:hanging="360"/>
+      </w:pPr>
+      <w:rPr>
+        <w:rFonts w:ascii="OpenSymbol" w:hAnsi="OpenSymbol" w:cs="OpenSymbol" w:hint="default"/>
+      </w:rPr>
+    </w:lvl>
+    <w:lvl w:ilvl="6">
+      <w:start w:val="1"/>
+      <w:numFmt w:val="bullet"/>
+      <w:lvlText w:val=""/>
+      <w:lvlJc w:val="left"/>
+      <w:pPr>
+        <w:tabs>
+          <w:tab w:val="num" w:pos="2880"/>
+        </w:tabs>
+        <w:ind w:left="2880" w:hanging="360"/>
+      </w:pPr>
+      <w:rPr>
+        <w:rFonts w:ascii="Symbol" w:hAnsi="Symbol" w:cs="Symbol" w:hint="default"/>
+      </w:rPr>
+    </w:lvl>
+    <w:lvl w:ilvl="7">
+      <w:start w:val="1"/>
+      <w:numFmt w:val="bullet"/>
+      <w:lvlText w:val="◦"/>
+      <w:lvlJc w:val="left"/>
+      <w:pPr>
+        <w:tabs>
+          <w:tab w:val="num" w:pos="3240"/>
+        </w:tabs>
+        <w:ind w:left="3240" w:hanging="360"/>
+      </w:pPr>
+      <w:rPr>
+        <w:rFonts w:ascii="OpenSymbol" w:hAnsi="OpenSymbol" w:cs="OpenSymbol" w:hint="default"/>
+      </w:rPr>
+    </w:lvl>
+    <w:lvl w:ilvl="8">
+      <w:start w:val="1"/>
+      <w:numFmt w:val="bullet"/>
+      <w:lvlText w:val="▪"/>
+      <w:lvlJc w:val="left"/>
+      <w:pPr>
+        <w:tabs>
+          <w:tab w:val="num" w:pos="3600"/>
+        </w:tabs>
+        <w:ind w:left="3600" w:hanging="360"/>
+      </w:pPr>
+      <w:rPr>
+        <w:rFonts w:ascii="OpenSymbol" w:hAnsi="OpenSymbol" w:cs="OpenSymbol" w:hint="default"/>
+      </w:rPr>
+    </w:lvl>
+  </w:abstractNum>
+  <w:abstractNum w:abstractNumId="11">
+    <w:lvl w:ilvl="0">
+      <w:start w:val="1"/>
+      <w:numFmt w:val="bullet"/>
+      <w:lvlText w:val=""/>
+      <w:lvlJc w:val="left"/>
+      <w:pPr>
+        <w:tabs>
+          <w:tab w:val="num" w:pos="720"/>
+        </w:tabs>
+        <w:ind w:left="720" w:hanging="360"/>
+      </w:pPr>
+      <w:rPr>
+        <w:rFonts w:ascii="Symbol" w:hAnsi="Symbol" w:cs="Symbol" w:hint="default"/>
+      </w:rPr>
+    </w:lvl>
+    <w:lvl w:ilvl="1">
+      <w:start w:val="1"/>
+      <w:numFmt w:val="bullet"/>
+      <w:lvlText w:val="◦"/>
+      <w:lvlJc w:val="left"/>
+      <w:pPr>
+        <w:tabs>
+          <w:tab w:val="num" w:pos="1080"/>
+        </w:tabs>
+        <w:ind w:left="1080" w:hanging="360"/>
+      </w:pPr>
+      <w:rPr>
+        <w:rFonts w:ascii="OpenSymbol" w:hAnsi="OpenSymbol" w:cs="OpenSymbol" w:hint="default"/>
+      </w:rPr>
+    </w:lvl>
+    <w:lvl w:ilvl="2">
+      <w:start w:val="1"/>
+      <w:numFmt w:val="bullet"/>
+      <w:lvlText w:val="▪"/>
+      <w:lvlJc w:val="left"/>
+      <w:pPr>
+        <w:tabs>
+          <w:tab w:val="num" w:pos="1440"/>
+        </w:tabs>
+        <w:ind w:left="1440" w:hanging="360"/>
+      </w:pPr>
+      <w:rPr>
+        <w:rFonts w:ascii="OpenSymbol" w:hAnsi="OpenSymbol" w:cs="OpenSymbol" w:hint="default"/>
+      </w:rPr>
+    </w:lvl>
+    <w:lvl w:ilvl="3">
+      <w:start w:val="1"/>
+      <w:numFmt w:val="bullet"/>
+      <w:lvlText w:val=""/>
+      <w:lvlJc w:val="left"/>
+      <w:pPr>
+        <w:tabs>
+          <w:tab w:val="num" w:pos="1800"/>
+        </w:tabs>
+        <w:ind w:left="1800" w:hanging="360"/>
+      </w:pPr>
+      <w:rPr>
+        <w:rFonts w:ascii="Symbol" w:hAnsi="Symbol" w:cs="Symbol" w:hint="default"/>
+      </w:rPr>
+    </w:lvl>
+    <w:lvl w:ilvl="4">
+      <w:start w:val="1"/>
+      <w:numFmt w:val="bullet"/>
+      <w:lvlText w:val="◦"/>
+      <w:lvlJc w:val="left"/>
+      <w:pPr>
+        <w:tabs>
+          <w:tab w:val="num" w:pos="2160"/>
+        </w:tabs>
+        <w:ind w:left="2160" w:hanging="360"/>
+      </w:pPr>
+      <w:rPr>
+        <w:rFonts w:ascii="OpenSymbol" w:hAnsi="OpenSymbol" w:cs="OpenSymbol" w:hint="default"/>
+      </w:rPr>
+    </w:lvl>
+    <w:lvl w:ilvl="5">
+      <w:start w:val="1"/>
+      <w:numFmt w:val="bullet"/>
+      <w:lvlText w:val="▪"/>
+      <w:lvlJc w:val="left"/>
+      <w:pPr>
+        <w:tabs>
+          <w:tab w:val="num" w:pos="2520"/>
+        </w:tabs>
+        <w:ind w:left="2520" w:hanging="360"/>
+      </w:pPr>
+      <w:rPr>
+        <w:rFonts w:ascii="OpenSymbol" w:hAnsi="OpenSymbol" w:cs="OpenSymbol" w:hint="default"/>
+      </w:rPr>
+    </w:lvl>
+    <w:lvl w:ilvl="6">
+      <w:start w:val="1"/>
+      <w:numFmt w:val="bullet"/>
+      <w:lvlText w:val=""/>
+      <w:lvlJc w:val="left"/>
+      <w:pPr>
+        <w:tabs>
+          <w:tab w:val="num" w:pos="2880"/>
+        </w:tabs>
+        <w:ind w:left="2880" w:hanging="360"/>
+      </w:pPr>
+      <w:rPr>
+        <w:rFonts w:ascii="Symbol" w:hAnsi="Symbol" w:cs="Symbol" w:hint="default"/>
+      </w:rPr>
+    </w:lvl>
+    <w:lvl w:ilvl="7">
+      <w:start w:val="1"/>
+      <w:numFmt w:val="bullet"/>
+      <w:lvlText w:val="◦"/>
+      <w:lvlJc w:val="left"/>
+      <w:pPr>
+        <w:tabs>
+          <w:tab w:val="num" w:pos="3240"/>
+        </w:tabs>
+        <w:ind w:left="3240" w:hanging="360"/>
+      </w:pPr>
+      <w:rPr>
+        <w:rFonts w:ascii="OpenSymbol" w:hAnsi="OpenSymbol" w:cs="OpenSymbol" w:hint="default"/>
+      </w:rPr>
+    </w:lvl>
+    <w:lvl w:ilvl="8">
+      <w:start w:val="1"/>
+      <w:numFmt w:val="bullet"/>
+      <w:lvlText w:val="▪"/>
+      <w:lvlJc w:val="left"/>
+      <w:pPr>
+        <w:tabs>
+          <w:tab w:val="num" w:pos="3600"/>
+        </w:tabs>
+        <w:ind w:left="3600" w:hanging="360"/>
+      </w:pPr>
+      <w:rPr>
+        <w:rFonts w:ascii="OpenSymbol" w:hAnsi="OpenSymbol" w:cs="OpenSymbol" w:hint="default"/>
+      </w:rPr>
+    </w:lvl>
+  </w:abstractNum>
+  <w:abstractNum w:abstractNumId="12">
+    <w:lvl w:ilvl="0">
+      <w:start w:val="1"/>
+      <w:numFmt w:val="bullet"/>
+      <w:lvlText w:val=""/>
+      <w:lvlJc w:val="left"/>
+      <w:pPr>
+        <w:tabs>
+          <w:tab w:val="num" w:pos="720"/>
+        </w:tabs>
+        <w:ind w:left="720" w:hanging="360"/>
+      </w:pPr>
+      <w:rPr>
+        <w:rFonts w:ascii="Symbol" w:hAnsi="Symbol" w:cs="Symbol" w:hint="default"/>
+      </w:rPr>
+    </w:lvl>
+    <w:lvl w:ilvl="1">
+      <w:start w:val="1"/>
+      <w:numFmt w:val="bullet"/>
+      <w:lvlText w:val="◦"/>
+      <w:lvlJc w:val="left"/>
+      <w:pPr>
+        <w:tabs>
+          <w:tab w:val="num" w:pos="1080"/>
+        </w:tabs>
+        <w:ind w:left="1080" w:hanging="360"/>
+      </w:pPr>
+      <w:rPr>
+        <w:rFonts w:ascii="OpenSymbol" w:hAnsi="OpenSymbol" w:cs="OpenSymbol" w:hint="default"/>
+      </w:rPr>
+    </w:lvl>
+    <w:lvl w:ilvl="2">
+      <w:start w:val="1"/>
+      <w:numFmt w:val="bullet"/>
+      <w:lvlText w:val="▪"/>
+      <w:lvlJc w:val="left"/>
+      <w:pPr>
+        <w:tabs>
+          <w:tab w:val="num" w:pos="1440"/>
+        </w:tabs>
+        <w:ind w:left="1440" w:hanging="360"/>
+      </w:pPr>
+      <w:rPr>
+        <w:rFonts w:ascii="OpenSymbol" w:hAnsi="OpenSymbol" w:cs="OpenSymbol" w:hint="default"/>
+      </w:rPr>
+    </w:lvl>
+    <w:lvl w:ilvl="3">
+      <w:start w:val="1"/>
+      <w:numFmt w:val="bullet"/>
+      <w:lvlText w:val=""/>
+      <w:lvlJc w:val="left"/>
+      <w:pPr>
+        <w:tabs>
+          <w:tab w:val="num" w:pos="1800"/>
+        </w:tabs>
+        <w:ind w:left="1800" w:hanging="360"/>
+      </w:pPr>
+      <w:rPr>
+        <w:rFonts w:ascii="Symbol" w:hAnsi="Symbol" w:cs="Symbol" w:hint="default"/>
+      </w:rPr>
+    </w:lvl>
+    <w:lvl w:ilvl="4">
+      <w:start w:val="1"/>
+      <w:numFmt w:val="bullet"/>
+      <w:lvlText w:val="◦"/>
+      <w:lvlJc w:val="left"/>
+      <w:pPr>
+        <w:tabs>
+          <w:tab w:val="num" w:pos="2160"/>
+        </w:tabs>
+        <w:ind w:left="2160" w:hanging="360"/>
+      </w:pPr>
+      <w:rPr>
+        <w:rFonts w:ascii="OpenSymbol" w:hAnsi="OpenSymbol" w:cs="OpenSymbol" w:hint="default"/>
+      </w:rPr>
+    </w:lvl>
+    <w:lvl w:ilvl="5">
+      <w:start w:val="1"/>
+      <w:numFmt w:val="bullet"/>
+      <w:lvlText w:val="▪"/>
+      <w:lvlJc w:val="left"/>
+      <w:pPr>
+        <w:tabs>
+          <w:tab w:val="num" w:pos="2520"/>
+        </w:tabs>
+        <w:ind w:left="2520" w:hanging="360"/>
+      </w:pPr>
+      <w:rPr>
+        <w:rFonts w:ascii="OpenSymbol" w:hAnsi="OpenSymbol" w:cs="OpenSymbol" w:hint="default"/>
+      </w:rPr>
+    </w:lvl>
+    <w:lvl w:ilvl="6">
+      <w:start w:val="1"/>
+      <w:numFmt w:val="bullet"/>
+      <w:lvlText w:val=""/>
+      <w:lvlJc w:val="left"/>
+      <w:pPr>
+        <w:tabs>
+          <w:tab w:val="num" w:pos="2880"/>
+        </w:tabs>
+        <w:ind w:left="2880" w:hanging="360"/>
+      </w:pPr>
+      <w:rPr>
+        <w:rFonts w:ascii="Symbol" w:hAnsi="Symbol" w:cs="Symbol" w:hint="default"/>
+      </w:rPr>
+    </w:lvl>
+    <w:lvl w:ilvl="7">
+      <w:start w:val="1"/>
+      <w:numFmt w:val="bullet"/>
+      <w:lvlText w:val="◦"/>
+      <w:lvlJc w:val="left"/>
+      <w:pPr>
+        <w:tabs>
+          <w:tab w:val="num" w:pos="3240"/>
+        </w:tabs>
+        <w:ind w:left="3240" w:hanging="360"/>
+      </w:pPr>
+      <w:rPr>
+        <w:rFonts w:ascii="OpenSymbol" w:hAnsi="OpenSymbol" w:cs="OpenSymbol" w:hint="default"/>
+      </w:rPr>
+    </w:lvl>
+    <w:lvl w:ilvl="8">
+      <w:start w:val="1"/>
+      <w:numFmt w:val="bullet"/>
+      <w:lvlText w:val="▪"/>
+      <w:lvlJc w:val="left"/>
+      <w:pPr>
+        <w:tabs>
+          <w:tab w:val="num" w:pos="3600"/>
+        </w:tabs>
+        <w:ind w:left="3600" w:hanging="360"/>
+      </w:pPr>
+      <w:rPr>
+        <w:rFonts w:ascii="OpenSymbol" w:hAnsi="OpenSymbol" w:cs="OpenSymbol" w:hint="default"/>
+      </w:rPr>
+    </w:lvl>
+  </w:abstractNum>
+  <w:abstractNum w:abstractNumId="13">
+    <w:lvl w:ilvl="0">
+      <w:start w:val="1"/>
+      <w:numFmt w:val="bullet"/>
+      <w:lvlText w:val=""/>
+      <w:lvlJc w:val="left"/>
+      <w:pPr>
+        <w:tabs>
+          <w:tab w:val="num" w:pos="720"/>
+        </w:tabs>
+        <w:ind w:left="720" w:hanging="360"/>
+      </w:pPr>
+      <w:rPr>
+        <w:rFonts w:ascii="Symbol" w:hAnsi="Symbol" w:cs="Symbol" w:hint="default"/>
+      </w:rPr>
+    </w:lvl>
+    <w:lvl w:ilvl="1">
+      <w:start w:val="1"/>
+      <w:numFmt w:val="bullet"/>
+      <w:lvlText w:val="◦"/>
+      <w:lvlJc w:val="left"/>
+      <w:pPr>
+        <w:tabs>
+          <w:tab w:val="num" w:pos="1080"/>
+        </w:tabs>
+        <w:ind w:left="1080" w:hanging="360"/>
+      </w:pPr>
+      <w:rPr>
+        <w:rFonts w:ascii="OpenSymbol" w:hAnsi="OpenSymbol" w:cs="OpenSymbol" w:hint="default"/>
+      </w:rPr>
+    </w:lvl>
+    <w:lvl w:ilvl="2">
+      <w:start w:val="1"/>
+      <w:numFmt w:val="bullet"/>
+      <w:lvlText w:val="▪"/>
+      <w:lvlJc w:val="left"/>
+      <w:pPr>
+        <w:tabs>
+          <w:tab w:val="num" w:pos="1440"/>
+        </w:tabs>
+        <w:ind w:left="1440" w:hanging="360"/>
+      </w:pPr>
+      <w:rPr>
+        <w:rFonts w:ascii="OpenSymbol" w:hAnsi="OpenSymbol" w:cs="OpenSymbol" w:hint="default"/>
+      </w:rPr>
+    </w:lvl>
+    <w:lvl w:ilvl="3">
+      <w:start w:val="1"/>
+      <w:numFmt w:val="bullet"/>
+      <w:lvlText w:val=""/>
+      <w:lvlJc w:val="left"/>
+      <w:pPr>
+        <w:tabs>
+          <w:tab w:val="num" w:pos="1800"/>
+        </w:tabs>
+        <w:ind w:left="1800" w:hanging="360"/>
+      </w:pPr>
+      <w:rPr>
+        <w:rFonts w:ascii="Symbol" w:hAnsi="Symbol" w:cs="Symbol" w:hint="default"/>
+      </w:rPr>
+    </w:lvl>
+    <w:lvl w:ilvl="4">
+      <w:start w:val="1"/>
+      <w:numFmt w:val="bullet"/>
+      <w:lvlText w:val="◦"/>
+      <w:lvlJc w:val="left"/>
+      <w:pPr>
+        <w:tabs>
+          <w:tab w:val="num" w:pos="2160"/>
+        </w:tabs>
+        <w:ind w:left="2160" w:hanging="360"/>
+      </w:pPr>
+      <w:rPr>
+        <w:rFonts w:ascii="OpenSymbol" w:hAnsi="OpenSymbol" w:cs="OpenSymbol" w:hint="default"/>
+      </w:rPr>
+    </w:lvl>
+    <w:lvl w:ilvl="5">
+      <w:start w:val="1"/>
+      <w:numFmt w:val="bullet"/>
+      <w:lvlText w:val="▪"/>
+      <w:lvlJc w:val="left"/>
+      <w:pPr>
+        <w:tabs>
+          <w:tab w:val="num" w:pos="2520"/>
+        </w:tabs>
+        <w:ind w:left="2520" w:hanging="360"/>
+      </w:pPr>
+      <w:rPr>
+        <w:rFonts w:ascii="OpenSymbol" w:hAnsi="OpenSymbol" w:cs="OpenSymbol" w:hint="default"/>
+      </w:rPr>
+    </w:lvl>
+    <w:lvl w:ilvl="6">
+      <w:start w:val="1"/>
+      <w:numFmt w:val="bullet"/>
+      <w:lvlText w:val=""/>
+      <w:lvlJc w:val="left"/>
+      <w:pPr>
+        <w:tabs>
+          <w:tab w:val="num" w:pos="2880"/>
+        </w:tabs>
+        <w:ind w:left="2880" w:hanging="360"/>
+      </w:pPr>
+      <w:rPr>
+        <w:rFonts w:ascii="Symbol" w:hAnsi="Symbol" w:cs="Symbol" w:hint="default"/>
+      </w:rPr>
+    </w:lvl>
+    <w:lvl w:ilvl="7">
+      <w:start w:val="1"/>
+      <w:numFmt w:val="bullet"/>
+      <w:lvlText w:val="◦"/>
+      <w:lvlJc w:val="left"/>
+      <w:pPr>
+        <w:tabs>
+          <w:tab w:val="num" w:pos="3240"/>
+        </w:tabs>
+        <w:ind w:left="3240" w:hanging="360"/>
+      </w:pPr>
+      <w:rPr>
+        <w:rFonts w:ascii="OpenSymbol" w:hAnsi="OpenSymbol" w:cs="OpenSymbol" w:hint="default"/>
+      </w:rPr>
+    </w:lvl>
+    <w:lvl w:ilvl="8">
+      <w:start w:val="1"/>
+      <w:numFmt w:val="bullet"/>
+      <w:lvlText w:val="▪"/>
+      <w:lvlJc w:val="left"/>
+      <w:pPr>
+        <w:tabs>
+          <w:tab w:val="num" w:pos="3600"/>
+        </w:tabs>
+        <w:ind w:left="3600" w:hanging="360"/>
+      </w:pPr>
+      <w:rPr>
+        <w:rFonts w:ascii="OpenSymbol" w:hAnsi="OpenSymbol" w:cs="OpenSymbol" w:hint="default"/>
+      </w:rPr>
+    </w:lvl>
+  </w:abstractNum>
+  <w:abstractNum w:abstractNumId="14">
+    <w:lvl w:ilvl="0">
+      <w:start w:val="1"/>
+      <w:numFmt w:val="bullet"/>
+      <w:lvlText w:val=""/>
+      <w:lvlJc w:val="left"/>
+      <w:pPr>
+        <w:tabs>
+          <w:tab w:val="num" w:pos="720"/>
+        </w:tabs>
+        <w:ind w:left="720" w:hanging="360"/>
+      </w:pPr>
+      <w:rPr>
+        <w:rFonts w:ascii="Symbol" w:hAnsi="Symbol" w:cs="Symbol" w:hint="default"/>
+      </w:rPr>
+    </w:lvl>
+    <w:lvl w:ilvl="1">
+      <w:start w:val="1"/>
+      <w:numFmt w:val="bullet"/>
+      <w:lvlText w:val="◦"/>
+      <w:lvlJc w:val="left"/>
+      <w:pPr>
+        <w:tabs>
+          <w:tab w:val="num" w:pos="1080"/>
+        </w:tabs>
+        <w:ind w:left="1080" w:hanging="360"/>
+      </w:pPr>
+      <w:rPr>
+        <w:rFonts w:ascii="OpenSymbol" w:hAnsi="OpenSymbol" w:cs="OpenSymbol" w:hint="default"/>
+      </w:rPr>
+    </w:lvl>
+    <w:lvl w:ilvl="2">
+      <w:start w:val="1"/>
+      <w:numFmt w:val="bullet"/>
+      <w:lvlText w:val="▪"/>
+      <w:lvlJc w:val="left"/>
+      <w:pPr>
+        <w:tabs>
+          <w:tab w:val="num" w:pos="1440"/>
+        </w:tabs>
+        <w:ind w:left="1440" w:hanging="360"/>
+      </w:pPr>
+      <w:rPr>
+        <w:rFonts w:ascii="OpenSymbol" w:hAnsi="OpenSymbol" w:cs="OpenSymbol" w:hint="default"/>
+      </w:rPr>
+    </w:lvl>
+    <w:lvl w:ilvl="3">
+      <w:start w:val="1"/>
+      <w:numFmt w:val="bullet"/>
+      <w:lvlText w:val=""/>
+      <w:lvlJc w:val="left"/>
+      <w:pPr>
+        <w:tabs>
+          <w:tab w:val="num" w:pos="1800"/>
+        </w:tabs>
+        <w:ind w:left="1800" w:hanging="360"/>
+      </w:pPr>
+      <w:rPr>
+        <w:rFonts w:ascii="Symbol" w:hAnsi="Symbol" w:cs="Symbol" w:hint="default"/>
+      </w:rPr>
+    </w:lvl>
+    <w:lvl w:ilvl="4">
+      <w:start w:val="1"/>
+      <w:numFmt w:val="bullet"/>
+      <w:lvlText w:val="◦"/>
+      <w:lvlJc w:val="left"/>
+      <w:pPr>
+        <w:tabs>
+          <w:tab w:val="num" w:pos="2160"/>
+        </w:tabs>
+        <w:ind w:left="2160" w:hanging="360"/>
+      </w:pPr>
+      <w:rPr>
+        <w:rFonts w:ascii="OpenSymbol" w:hAnsi="OpenSymbol" w:cs="OpenSymbol" w:hint="default"/>
+      </w:rPr>
+    </w:lvl>
+    <w:lvl w:ilvl="5">
+      <w:start w:val="1"/>
+      <w:numFmt w:val="bullet"/>
+      <w:lvlText w:val="▪"/>
+      <w:lvlJc w:val="left"/>
+      <w:pPr>
+        <w:tabs>
+          <w:tab w:val="num" w:pos="2520"/>
+        </w:tabs>
+        <w:ind w:left="2520" w:hanging="360"/>
+      </w:pPr>
+      <w:rPr>
+        <w:rFonts w:ascii="OpenSymbol" w:hAnsi="OpenSymbol" w:cs="OpenSymbol" w:hint="default"/>
+      </w:rPr>
+    </w:lvl>
+    <w:lvl w:ilvl="6">
+      <w:start w:val="1"/>
+      <w:numFmt w:val="bullet"/>
+      <w:lvlText w:val=""/>
+      <w:lvlJc w:val="left"/>
+      <w:pPr>
+        <w:tabs>
+          <w:tab w:val="num" w:pos="2880"/>
+        </w:tabs>
+        <w:ind w:left="2880" w:hanging="360"/>
+      </w:pPr>
+      <w:rPr>
+        <w:rFonts w:ascii="Symbol" w:hAnsi="Symbol" w:cs="Symbol" w:hint="default"/>
+      </w:rPr>
+    </w:lvl>
+    <w:lvl w:ilvl="7">
+      <w:start w:val="1"/>
+      <w:numFmt w:val="bullet"/>
+      <w:lvlText w:val="◦"/>
+      <w:lvlJc w:val="left"/>
+      <w:pPr>
+        <w:tabs>
+          <w:tab w:val="num" w:pos="3240"/>
+        </w:tabs>
+        <w:ind w:left="3240" w:hanging="360"/>
+      </w:pPr>
+      <w:rPr>
+        <w:rFonts w:ascii="OpenSymbol" w:hAnsi="OpenSymbol" w:cs="OpenSymbol" w:hint="default"/>
+      </w:rPr>
+    </w:lvl>
+    <w:lvl w:ilvl="8">
+      <w:start w:val="1"/>
+      <w:numFmt w:val="bullet"/>
+      <w:lvlText w:val="▪"/>
+      <w:lvlJc w:val="left"/>
+      <w:pPr>
+        <w:tabs>
+          <w:tab w:val="num" w:pos="3600"/>
+        </w:tabs>
+        <w:ind w:left="3600" w:hanging="360"/>
+      </w:pPr>
+      <w:rPr>
+        <w:rFonts w:ascii="OpenSymbol" w:hAnsi="OpenSymbol" w:cs="OpenSymbol" w:hint="default"/>
+      </w:rPr>
+    </w:lvl>
+  </w:abstractNum>
+  <w:abstractNum w:abstractNumId="15">
+    <w:lvl w:ilvl="0">
+      <w:start w:val="1"/>
+      <w:numFmt w:val="bullet"/>
+      <w:lvlText w:val=""/>
+      <w:lvlJc w:val="left"/>
+      <w:pPr>
+        <w:tabs>
+          <w:tab w:val="num" w:pos="720"/>
+        </w:tabs>
+        <w:ind w:left="720" w:hanging="360"/>
+      </w:pPr>
+      <w:rPr>
+        <w:rFonts w:ascii="Symbol" w:hAnsi="Symbol" w:cs="Symbol" w:hint="default"/>
+      </w:rPr>
+    </w:lvl>
+    <w:lvl w:ilvl="1">
+      <w:start w:val="1"/>
+      <w:numFmt w:val="bullet"/>
+      <w:lvlText w:val="◦"/>
+      <w:lvlJc w:val="left"/>
+      <w:pPr>
+        <w:tabs>
+          <w:tab w:val="num" w:pos="1080"/>
+        </w:tabs>
+        <w:ind w:left="1080" w:hanging="360"/>
+      </w:pPr>
+      <w:rPr>
+        <w:rFonts w:ascii="OpenSymbol" w:hAnsi="OpenSymbol" w:cs="OpenSymbol" w:hint="default"/>
+      </w:rPr>
+    </w:lvl>
+    <w:lvl w:ilvl="2">
+      <w:start w:val="1"/>
+      <w:numFmt w:val="bullet"/>
+      <w:lvlText w:val="▪"/>
+      <w:lvlJc w:val="left"/>
+      <w:pPr>
+        <w:tabs>
+          <w:tab w:val="num" w:pos="1440"/>
+        </w:tabs>
+        <w:ind w:left="1440" w:hanging="360"/>
+      </w:pPr>
+      <w:rPr>
+        <w:rFonts w:ascii="OpenSymbol" w:hAnsi="OpenSymbol" w:cs="OpenSymbol" w:hint="default"/>
+      </w:rPr>
+    </w:lvl>
+    <w:lvl w:ilvl="3">
+      <w:start w:val="1"/>
+      <w:numFmt w:val="bullet"/>
+      <w:lvlText w:val=""/>
+      <w:lvlJc w:val="left"/>
+      <w:pPr>
+        <w:tabs>
+          <w:tab w:val="num" w:pos="1800"/>
+        </w:tabs>
+        <w:ind w:left="1800" w:hanging="360"/>
+      </w:pPr>
+      <w:rPr>
+        <w:rFonts w:ascii="Symbol" w:hAnsi="Symbol" w:cs="Symbol" w:hint="default"/>
+      </w:rPr>
+    </w:lvl>
+    <w:lvl w:ilvl="4">
+      <w:start w:val="1"/>
+      <w:numFmt w:val="bullet"/>
+      <w:lvlText w:val="◦"/>
+      <w:lvlJc w:val="left"/>
+      <w:pPr>
+        <w:tabs>
+          <w:tab w:val="num" w:pos="2160"/>
+        </w:tabs>
+        <w:ind w:left="2160" w:hanging="360"/>
+      </w:pPr>
+      <w:rPr>
+        <w:rFonts w:ascii="OpenSymbol" w:hAnsi="OpenSymbol" w:cs="OpenSymbol" w:hint="default"/>
+      </w:rPr>
+    </w:lvl>
+    <w:lvl w:ilvl="5">
+      <w:start w:val="1"/>
+      <w:numFmt w:val="bullet"/>
+      <w:lvlText w:val="▪"/>
+      <w:lvlJc w:val="left"/>
+      <w:pPr>
+        <w:tabs>
+          <w:tab w:val="num" w:pos="2520"/>
+        </w:tabs>
+        <w:ind w:left="2520" w:hanging="360"/>
+      </w:pPr>
+      <w:rPr>
+        <w:rFonts w:ascii="OpenSymbol" w:hAnsi="OpenSymbol" w:cs="OpenSymbol" w:hint="default"/>
+      </w:rPr>
+    </w:lvl>
+    <w:lvl w:ilvl="6">
+      <w:start w:val="1"/>
+      <w:numFmt w:val="bullet"/>
+      <w:lvlText w:val=""/>
+      <w:lvlJc w:val="left"/>
+      <w:pPr>
+        <w:tabs>
+          <w:tab w:val="num" w:pos="2880"/>
+        </w:tabs>
+        <w:ind w:left="2880" w:hanging="360"/>
+      </w:pPr>
+      <w:rPr>
+        <w:rFonts w:ascii="Symbol" w:hAnsi="Symbol" w:cs="Symbol" w:hint="default"/>
+      </w:rPr>
+    </w:lvl>
+    <w:lvl w:ilvl="7">
+      <w:start w:val="1"/>
+      <w:numFmt w:val="bullet"/>
+      <w:lvlText w:val="◦"/>
+      <w:lvlJc w:val="left"/>
+      <w:pPr>
+        <w:tabs>
+          <w:tab w:val="num" w:pos="3240"/>
+        </w:tabs>
+        <w:ind w:left="3240" w:hanging="360"/>
+      </w:pPr>
+      <w:rPr>
+        <w:rFonts w:ascii="OpenSymbol" w:hAnsi="OpenSymbol" w:cs="OpenSymbol" w:hint="default"/>
+      </w:rPr>
+    </w:lvl>
+    <w:lvl w:ilvl="8">
+      <w:start w:val="1"/>
+      <w:numFmt w:val="bullet"/>
+      <w:lvlText w:val="▪"/>
+      <w:lvlJc w:val="left"/>
+      <w:pPr>
+        <w:tabs>
+          <w:tab w:val="num" w:pos="3600"/>
+        </w:tabs>
+        <w:ind w:left="3600" w:hanging="360"/>
+      </w:pPr>
+      <w:rPr>
+        <w:rFonts w:ascii="OpenSymbol" w:hAnsi="OpenSymbol" w:cs="OpenSymbol" w:hint="default"/>
+      </w:rPr>
+    </w:lvl>
+  </w:abstractNum>
+  <w:abstractNum w:abstractNumId="16">
+    <w:lvl w:ilvl="0">
+      <w:start w:val="1"/>
+      <w:numFmt w:val="bullet"/>
+      <w:lvlText w:val=""/>
+      <w:lvlJc w:val="left"/>
+      <w:pPr>
+        <w:tabs>
+          <w:tab w:val="num" w:pos="720"/>
+        </w:tabs>
+        <w:ind w:left="720" w:hanging="360"/>
+      </w:pPr>
+      <w:rPr>
+        <w:rFonts w:ascii="Symbol" w:hAnsi="Symbol" w:cs="Symbol" w:hint="default"/>
+      </w:rPr>
+    </w:lvl>
+    <w:lvl w:ilvl="1">
+      <w:start w:val="1"/>
+      <w:numFmt w:val="bullet"/>
+      <w:lvlText w:val="◦"/>
+      <w:lvlJc w:val="left"/>
+      <w:pPr>
+        <w:tabs>
+          <w:tab w:val="num" w:pos="1080"/>
+        </w:tabs>
+        <w:ind w:left="1080" w:hanging="360"/>
+      </w:pPr>
+      <w:rPr>
+        <w:rFonts w:ascii="OpenSymbol" w:hAnsi="OpenSymbol" w:cs="OpenSymbol" w:hint="default"/>
+      </w:rPr>
+    </w:lvl>
+    <w:lvl w:ilvl="2">
+      <w:start w:val="1"/>
+      <w:numFmt w:val="bullet"/>
+      <w:lvlText w:val="▪"/>
+      <w:lvlJc w:val="left"/>
+      <w:pPr>
+        <w:tabs>
+          <w:tab w:val="num" w:pos="1440"/>
+        </w:tabs>
+        <w:ind w:left="1440" w:hanging="360"/>
+      </w:pPr>
+      <w:rPr>
+        <w:rFonts w:ascii="OpenSymbol" w:hAnsi="OpenSymbol" w:cs="OpenSymbol" w:hint="default"/>
+      </w:rPr>
+    </w:lvl>
+    <w:lvl w:ilvl="3">
+      <w:start w:val="1"/>
+      <w:numFmt w:val="bullet"/>
+      <w:lvlText w:val=""/>
+      <w:lvlJc w:val="left"/>
+      <w:pPr>
+        <w:tabs>
+          <w:tab w:val="num" w:pos="1800"/>
+        </w:tabs>
+        <w:ind w:left="1800" w:hanging="360"/>
+      </w:pPr>
+      <w:rPr>
+        <w:rFonts w:ascii="Symbol" w:hAnsi="Symbol" w:cs="Symbol" w:hint="default"/>
+      </w:rPr>
+    </w:lvl>
+    <w:lvl w:ilvl="4">
+      <w:start w:val="1"/>
+      <w:numFmt w:val="bullet"/>
+      <w:lvlText w:val="◦"/>
+      <w:lvlJc w:val="left"/>
+      <w:pPr>
+        <w:tabs>
+          <w:tab w:val="num" w:pos="2160"/>
+        </w:tabs>
+        <w:ind w:left="2160" w:hanging="360"/>
+      </w:pPr>
+      <w:rPr>
+        <w:rFonts w:ascii="OpenSymbol" w:hAnsi="OpenSymbol" w:cs="OpenSymbol" w:hint="default"/>
+      </w:rPr>
+    </w:lvl>
+    <w:lvl w:ilvl="5">
+      <w:start w:val="1"/>
+      <w:numFmt w:val="bullet"/>
+      <w:lvlText w:val="▪"/>
+      <w:lvlJc w:val="left"/>
+      <w:pPr>
+        <w:tabs>
+          <w:tab w:val="num" w:pos="2520"/>
+        </w:tabs>
+        <w:ind w:left="2520" w:hanging="360"/>
+      </w:pPr>
+      <w:rPr>
+        <w:rFonts w:ascii="OpenSymbol" w:hAnsi="OpenSymbol" w:cs="OpenSymbol" w:hint="default"/>
+      </w:rPr>
+    </w:lvl>
+    <w:lvl w:ilvl="6">
+      <w:start w:val="1"/>
+      <w:numFmt w:val="bullet"/>
+      <w:lvlText w:val=""/>
+      <w:lvlJc w:val="left"/>
+      <w:pPr>
+        <w:tabs>
+          <w:tab w:val="num" w:pos="2880"/>
+        </w:tabs>
+        <w:ind w:left="2880" w:hanging="360"/>
+      </w:pPr>
+      <w:rPr>
+        <w:rFonts w:ascii="Symbol" w:hAnsi="Symbol" w:cs="Symbol" w:hint="default"/>
+      </w:rPr>
+    </w:lvl>
+    <w:lvl w:ilvl="7">
+      <w:start w:val="1"/>
+      <w:numFmt w:val="bullet"/>
+      <w:lvlText w:val="◦"/>
+      <w:lvlJc w:val="left"/>
+      <w:pPr>
+        <w:tabs>
+          <w:tab w:val="num" w:pos="3240"/>
+        </w:tabs>
+        <w:ind w:left="3240" w:hanging="360"/>
+      </w:pPr>
+      <w:rPr>
+        <w:rFonts w:ascii="OpenSymbol" w:hAnsi="OpenSymbol" w:cs="OpenSymbol" w:hint="default"/>
+      </w:rPr>
+    </w:lvl>
+    <w:lvl w:ilvl="8">
+      <w:start w:val="1"/>
+      <w:numFmt w:val="bullet"/>
+      <w:lvlText w:val="▪"/>
+      <w:lvlJc w:val="left"/>
+      <w:pPr>
+        <w:tabs>
+          <w:tab w:val="num" w:pos="3600"/>
+        </w:tabs>
+        <w:ind w:left="3600" w:hanging="360"/>
+      </w:pPr>
+      <w:rPr>
+        <w:rFonts w:ascii="OpenSymbol" w:hAnsi="OpenSymbol" w:cs="OpenSymbol" w:hint="default"/>
+      </w:rPr>
+    </w:lvl>
+  </w:abstractNum>
+  <w:abstractNum w:abstractNumId="17">
+    <w:lvl w:ilvl="0">
+      <w:start w:val="1"/>
+      <w:numFmt w:val="bullet"/>
+      <w:lvlText w:val=""/>
+      <w:lvlJc w:val="left"/>
+      <w:pPr>
+        <w:tabs>
+          <w:tab w:val="num" w:pos="720"/>
+        </w:tabs>
+        <w:ind w:left="720" w:hanging="360"/>
+      </w:pPr>
+      <w:rPr>
+        <w:rFonts w:ascii="Symbol" w:hAnsi="Symbol" w:cs="Symbol" w:hint="default"/>
+      </w:rPr>
+    </w:lvl>
+    <w:lvl w:ilvl="1">
+      <w:start w:val="1"/>
+      <w:numFmt w:val="bullet"/>
+      <w:lvlText w:val="◦"/>
+      <w:lvlJc w:val="left"/>
+      <w:pPr>
+        <w:tabs>
+          <w:tab w:val="num" w:pos="1080"/>
+        </w:tabs>
+        <w:ind w:left="1080" w:hanging="360"/>
+      </w:pPr>
+      <w:rPr>
+        <w:rFonts w:ascii="OpenSymbol" w:hAnsi="OpenSymbol" w:cs="OpenSymbol" w:hint="default"/>
+      </w:rPr>
+    </w:lvl>
+    <w:lvl w:ilvl="2">
+      <w:start w:val="1"/>
+      <w:numFmt w:val="bullet"/>
+      <w:lvlText w:val="▪"/>
+      <w:lvlJc w:val="left"/>
+      <w:pPr>
+        <w:tabs>
+          <w:tab w:val="num" w:pos="1440"/>
+        </w:tabs>
+        <w:ind w:left="1440" w:hanging="360"/>
+      </w:pPr>
+      <w:rPr>
+        <w:rFonts w:ascii="OpenSymbol" w:hAnsi="OpenSymbol" w:cs="OpenSymbol" w:hint="default"/>
+      </w:rPr>
+    </w:lvl>
+    <w:lvl w:ilvl="3">
+      <w:start w:val="1"/>
+      <w:numFmt w:val="bullet"/>
+      <w:lvlText w:val=""/>
+      <w:lvlJc w:val="left"/>
+      <w:pPr>
+        <w:tabs>
+          <w:tab w:val="num" w:pos="1800"/>
+        </w:tabs>
+        <w:ind w:left="1800" w:hanging="360"/>
+      </w:pPr>
+      <w:rPr>
+        <w:rFonts w:ascii="Symbol" w:hAnsi="Symbol" w:cs="Symbol" w:hint="default"/>
+      </w:rPr>
+    </w:lvl>
+    <w:lvl w:ilvl="4">
+      <w:start w:val="1"/>
+      <w:numFmt w:val="bullet"/>
+      <w:lvlText w:val="◦"/>
+      <w:lvlJc w:val="left"/>
+      <w:pPr>
+        <w:tabs>
+          <w:tab w:val="num" w:pos="2160"/>
+        </w:tabs>
+        <w:ind w:left="2160" w:hanging="360"/>
+      </w:pPr>
+      <w:rPr>
+        <w:rFonts w:ascii="OpenSymbol" w:hAnsi="OpenSymbol" w:cs="OpenSymbol" w:hint="default"/>
+      </w:rPr>
+    </w:lvl>
+    <w:lvl w:ilvl="5">
+      <w:start w:val="1"/>
+      <w:numFmt w:val="bullet"/>
+      <w:lvlText w:val="▪"/>
+      <w:lvlJc w:val="left"/>
+      <w:pPr>
+        <w:tabs>
+          <w:tab w:val="num" w:pos="2520"/>
+        </w:tabs>
+        <w:ind w:left="2520" w:hanging="360"/>
+      </w:pPr>
+      <w:rPr>
+        <w:rFonts w:ascii="OpenSymbol" w:hAnsi="OpenSymbol" w:cs="OpenSymbol" w:hint="default"/>
+      </w:rPr>
+    </w:lvl>
+    <w:lvl w:ilvl="6">
+      <w:start w:val="1"/>
+      <w:numFmt w:val="bullet"/>
+      <w:lvlText w:val=""/>
+      <w:lvlJc w:val="left"/>
+      <w:pPr>
+        <w:tabs>
+          <w:tab w:val="num" w:pos="2880"/>
+        </w:tabs>
+        <w:ind w:left="2880" w:hanging="360"/>
+      </w:pPr>
+      <w:rPr>
+        <w:rFonts w:ascii="Symbol" w:hAnsi="Symbol" w:cs="Symbol" w:hint="default"/>
+      </w:rPr>
+    </w:lvl>
+    <w:lvl w:ilvl="7">
+      <w:start w:val="1"/>
+      <w:numFmt w:val="bullet"/>
+      <w:lvlText w:val="◦"/>
+      <w:lvlJc w:val="left"/>
+      <w:pPr>
+        <w:tabs>
+          <w:tab w:val="num" w:pos="3240"/>
+        </w:tabs>
+        <w:ind w:left="3240" w:hanging="360"/>
+      </w:pPr>
+      <w:rPr>
+        <w:rFonts w:ascii="OpenSymbol" w:hAnsi="OpenSymbol" w:cs="OpenSymbol" w:hint="default"/>
+      </w:rPr>
+    </w:lvl>
+    <w:lvl w:ilvl="8">
+      <w:start w:val="1"/>
+      <w:numFmt w:val="bullet"/>
+      <w:lvlText w:val="▪"/>
+      <w:lvlJc w:val="left"/>
+      <w:pPr>
+        <w:tabs>
+          <w:tab w:val="num" w:pos="3600"/>
+        </w:tabs>
+        <w:ind w:left="3600" w:hanging="360"/>
+      </w:pPr>
+      <w:rPr>
+        <w:rFonts w:ascii="OpenSymbol" w:hAnsi="OpenSymbol" w:cs="OpenSymbol" w:hint="default"/>
+      </w:rPr>
+    </w:lvl>
+  </w:abstractNum>
+  <w:abstractNum w:abstractNumId="18">
+    <w:lvl w:ilvl="0">
+      <w:start w:val="1"/>
+      <w:numFmt w:val="bullet"/>
+      <w:lvlText w:val=""/>
+      <w:lvlJc w:val="left"/>
+      <w:pPr>
+        <w:tabs>
+          <w:tab w:val="num" w:pos="720"/>
+        </w:tabs>
+        <w:ind w:left="720" w:hanging="360"/>
+      </w:pPr>
+      <w:rPr>
+        <w:rFonts w:ascii="Symbol" w:hAnsi="Symbol" w:cs="Symbol" w:hint="default"/>
+      </w:rPr>
+    </w:lvl>
+    <w:lvl w:ilvl="1">
+      <w:start w:val="1"/>
+      <w:numFmt w:val="bullet"/>
+      <w:lvlText w:val="◦"/>
+      <w:lvlJc w:val="left"/>
+      <w:pPr>
+        <w:tabs>
+          <w:tab w:val="num" w:pos="1080"/>
+        </w:tabs>
+        <w:ind w:left="1080" w:hanging="360"/>
+      </w:pPr>
+      <w:rPr>
+        <w:rFonts w:ascii="OpenSymbol" w:hAnsi="OpenSymbol" w:cs="OpenSymbol" w:hint="default"/>
+      </w:rPr>
+    </w:lvl>
+    <w:lvl w:ilvl="2">
+      <w:start w:val="1"/>
+      <w:numFmt w:val="bullet"/>
+      <w:lvlText w:val="▪"/>
+      <w:lvlJc w:val="left"/>
+      <w:pPr>
+        <w:tabs>
+          <w:tab w:val="num" w:pos="1440"/>
+        </w:tabs>
+        <w:ind w:left="1440" w:hanging="360"/>
+      </w:pPr>
+      <w:rPr>
+        <w:rFonts w:ascii="OpenSymbol" w:hAnsi="OpenSymbol" w:cs="OpenSymbol" w:hint="default"/>
+      </w:rPr>
+    </w:lvl>
+    <w:lvl w:ilvl="3">
+      <w:start w:val="1"/>
+      <w:numFmt w:val="bullet"/>
+      <w:lvlText w:val=""/>
+      <w:lvlJc w:val="left"/>
+      <w:pPr>
+        <w:tabs>
+          <w:tab w:val="num" w:pos="1800"/>
+        </w:tabs>
+        <w:ind w:left="1800" w:hanging="360"/>
+      </w:pPr>
+      <w:rPr>
+        <w:rFonts w:ascii="Symbol" w:hAnsi="Symbol" w:cs="Symbol" w:hint="default"/>
+      </w:rPr>
+    </w:lvl>
+    <w:lvl w:ilvl="4">
+      <w:start w:val="1"/>
+      <w:numFmt w:val="bullet"/>
+      <w:lvlText w:val="◦"/>
+      <w:lvlJc w:val="left"/>
+      <w:pPr>
+        <w:tabs>
+          <w:tab w:val="num" w:pos="2160"/>
+        </w:tabs>
+        <w:ind w:left="2160" w:hanging="360"/>
+      </w:pPr>
+      <w:rPr>
+        <w:rFonts w:ascii="OpenSymbol" w:hAnsi="OpenSymbol" w:cs="OpenSymbol" w:hint="default"/>
+      </w:rPr>
+    </w:lvl>
+    <w:lvl w:ilvl="5">
+      <w:start w:val="1"/>
+      <w:numFmt w:val="bullet"/>
+      <w:lvlText w:val="▪"/>
+      <w:lvlJc w:val="left"/>
+      <w:pPr>
+        <w:tabs>
+          <w:tab w:val="num" w:pos="2520"/>
+        </w:tabs>
+        <w:ind w:left="2520" w:hanging="360"/>
+      </w:pPr>
+      <w:rPr>
+        <w:rFonts w:ascii="OpenSymbol" w:hAnsi="OpenSymbol" w:cs="OpenSymbol" w:hint="default"/>
+      </w:rPr>
+    </w:lvl>
+    <w:lvl w:ilvl="6">
+      <w:start w:val="1"/>
+      <w:numFmt w:val="bullet"/>
+      <w:lvlText w:val=""/>
+      <w:lvlJc w:val="left"/>
+      <w:pPr>
+        <w:tabs>
+          <w:tab w:val="num" w:pos="2880"/>
+        </w:tabs>
+        <w:ind w:left="2880" w:hanging="360"/>
+      </w:pPr>
+      <w:rPr>
+        <w:rFonts w:ascii="Symbol" w:hAnsi="Symbol" w:cs="Symbol" w:hint="default"/>
+      </w:rPr>
+    </w:lvl>
+    <w:lvl w:ilvl="7">
+      <w:start w:val="1"/>
+      <w:numFmt w:val="bullet"/>
+      <w:lvlText w:val="◦"/>
+      <w:lvlJc w:val="left"/>
+      <w:pPr>
+        <w:tabs>
+          <w:tab w:val="num" w:pos="3240"/>
+        </w:tabs>
+        <w:ind w:left="3240" w:hanging="360"/>
+      </w:pPr>
+      <w:rPr>
+        <w:rFonts w:ascii="OpenSymbol" w:hAnsi="OpenSymbol" w:cs="OpenSymbol" w:hint="default"/>
+      </w:rPr>
+    </w:lvl>
+    <w:lvl w:ilvl="8">
+      <w:start w:val="1"/>
+      <w:numFmt w:val="bullet"/>
+      <w:lvlText w:val="▪"/>
+      <w:lvlJc w:val="left"/>
+      <w:pPr>
+        <w:tabs>
+          <w:tab w:val="num" w:pos="3600"/>
+        </w:tabs>
+        <w:ind w:left="3600" w:hanging="360"/>
+      </w:pPr>
+      <w:rPr>
+        <w:rFonts w:ascii="OpenSymbol" w:hAnsi="OpenSymbol" w:cs="OpenSymbol" w:hint="default"/>
+      </w:rPr>
+    </w:lvl>
+  </w:abstractNum>
+  <w:abstractNum w:abstractNumId="19">
+    <w:lvl w:ilvl="0">
+      <w:start w:val="1"/>
+      <w:numFmt w:val="bullet"/>
+      <w:lvlText w:val=""/>
+      <w:lvlJc w:val="left"/>
+      <w:pPr>
+        <w:tabs>
+          <w:tab w:val="num" w:pos="720"/>
+        </w:tabs>
+        <w:ind w:left="720" w:hanging="360"/>
+      </w:pPr>
+      <w:rPr>
+        <w:rFonts w:ascii="Symbol" w:hAnsi="Symbol" w:cs="Symbol" w:hint="default"/>
+      </w:rPr>
+    </w:lvl>
+    <w:lvl w:ilvl="1">
+      <w:start w:val="1"/>
+      <w:numFmt w:val="bullet"/>
+      <w:lvlText w:val="◦"/>
+      <w:lvlJc w:val="left"/>
+      <w:pPr>
+        <w:tabs>
+          <w:tab w:val="num" w:pos="1080"/>
+        </w:tabs>
+        <w:ind w:left="1080" w:hanging="360"/>
+      </w:pPr>
+      <w:rPr>
+        <w:rFonts w:ascii="OpenSymbol" w:hAnsi="OpenSymbol" w:cs="OpenSymbol" w:hint="default"/>
+      </w:rPr>
+    </w:lvl>
+    <w:lvl w:ilvl="2">
+      <w:start w:val="1"/>
+      <w:numFmt w:val="bullet"/>
+      <w:lvlText w:val="▪"/>
+      <w:lvlJc w:val="left"/>
+      <w:pPr>
+        <w:tabs>
+          <w:tab w:val="num" w:pos="1440"/>
+        </w:tabs>
+        <w:ind w:left="1440" w:hanging="360"/>
+      </w:pPr>
+      <w:rPr>
+        <w:rFonts w:ascii="OpenSymbol" w:hAnsi="OpenSymbol" w:cs="OpenSymbol" w:hint="default"/>
+      </w:rPr>
+    </w:lvl>
+    <w:lvl w:ilvl="3">
+      <w:start w:val="1"/>
+      <w:numFmt w:val="bullet"/>
+      <w:lvlText w:val=""/>
+      <w:lvlJc w:val="left"/>
+      <w:pPr>
+        <w:tabs>
+          <w:tab w:val="num" w:pos="1800"/>
+        </w:tabs>
+        <w:ind w:left="1800" w:hanging="360"/>
+      </w:pPr>
+      <w:rPr>
+        <w:rFonts w:ascii="Symbol" w:hAnsi="Symbol" w:cs="Symbol" w:hint="default"/>
+      </w:rPr>
+    </w:lvl>
+    <w:lvl w:ilvl="4">
+      <w:start w:val="1"/>
+      <w:numFmt w:val="bullet"/>
+      <w:lvlText w:val="◦"/>
+      <w:lvlJc w:val="left"/>
+      <w:pPr>
+        <w:tabs>
+          <w:tab w:val="num" w:pos="2160"/>
+        </w:tabs>
+        <w:ind w:left="2160" w:hanging="360"/>
+      </w:pPr>
+      <w:rPr>
+        <w:rFonts w:ascii="OpenSymbol" w:hAnsi="OpenSymbol" w:cs="OpenSymbol" w:hint="default"/>
+      </w:rPr>
+    </w:lvl>
+    <w:lvl w:ilvl="5">
+      <w:start w:val="1"/>
+      <w:numFmt w:val="bullet"/>
+      <w:lvlText w:val="▪"/>
+      <w:lvlJc w:val="left"/>
+      <w:pPr>
+        <w:tabs>
+          <w:tab w:val="num" w:pos="2520"/>
+        </w:tabs>
+        <w:ind w:left="2520" w:hanging="360"/>
+      </w:pPr>
+      <w:rPr>
+        <w:rFonts w:ascii="OpenSymbol" w:hAnsi="OpenSymbol" w:cs="OpenSymbol" w:hint="default"/>
+      </w:rPr>
+    </w:lvl>
+    <w:lvl w:ilvl="6">
+      <w:start w:val="1"/>
+      <w:numFmt w:val="bullet"/>
+      <w:lvlText w:val=""/>
+      <w:lvlJc w:val="left"/>
+      <w:pPr>
+        <w:tabs>
+          <w:tab w:val="num" w:pos="2880"/>
+        </w:tabs>
+        <w:ind w:left="2880" w:hanging="360"/>
+      </w:pPr>
+      <w:rPr>
+        <w:rFonts w:ascii="Symbol" w:hAnsi="Symbol" w:cs="Symbol" w:hint="default"/>
+      </w:rPr>
+    </w:lvl>
+    <w:lvl w:ilvl="7">
+      <w:start w:val="1"/>
+      <w:numFmt w:val="bullet"/>
+      <w:lvlText w:val="◦"/>
+      <w:lvlJc w:val="left"/>
+      <w:pPr>
+        <w:tabs>
+          <w:tab w:val="num" w:pos="3240"/>
+        </w:tabs>
+        <w:ind w:left="3240" w:hanging="360"/>
+      </w:pPr>
+      <w:rPr>
+        <w:rFonts w:ascii="OpenSymbol" w:hAnsi="OpenSymbol" w:cs="OpenSymbol" w:hint="default"/>
+      </w:rPr>
+    </w:lvl>
+    <w:lvl w:ilvl="8">
+      <w:start w:val="1"/>
+      <w:numFmt w:val="bullet"/>
+      <w:lvlText w:val="▪"/>
+      <w:lvlJc w:val="left"/>
+      <w:pPr>
+        <w:tabs>
+          <w:tab w:val="num" w:pos="3600"/>
+        </w:tabs>
+        <w:ind w:left="3600" w:hanging="360"/>
+      </w:pPr>
+      <w:rPr>
+        <w:rFonts w:ascii="OpenSymbol" w:hAnsi="OpenSymbol" w:cs="OpenSymbol" w:hint="default"/>
+      </w:rPr>
+    </w:lvl>
+  </w:abstractNum>
+  <w:abstractNum w:abstractNumId="20">
     <w:lvl w:ilvl="0">
       <w:start w:val="1"/>
       <w:numFmt w:val="none"/>
@@ -2265,6 +6176,36 @@
   <w:num w:numId="10">
     <w:abstractNumId w:val="10"/>
   </w:num>
+  <w:num w:numId="11">
+    <w:abstractNumId w:val="11"/>
+  </w:num>
+  <w:num w:numId="12">
+    <w:abstractNumId w:val="12"/>
+  </w:num>
+  <w:num w:numId="13">
+    <w:abstractNumId w:val="13"/>
+  </w:num>
+  <w:num w:numId="14">
+    <w:abstractNumId w:val="14"/>
+  </w:num>
+  <w:num w:numId="15">
+    <w:abstractNumId w:val="15"/>
+  </w:num>
+  <w:num w:numId="16">
+    <w:abstractNumId w:val="16"/>
+  </w:num>
+  <w:num w:numId="17">
+    <w:abstractNumId w:val="17"/>
+  </w:num>
+  <w:num w:numId="18">
+    <w:abstractNumId w:val="18"/>
+  </w:num>
+  <w:num w:numId="19">
+    <w:abstractNumId w:val="19"/>
+  </w:num>
+  <w:num w:numId="20">
+    <w:abstractNumId w:val="20"/>
+  </w:num>
 </w:numbering>
 </file>
 
@@ -2282,7 +6223,6 @@
     </w:rPrDefault>
     <w:pPrDefault>
       <w:pPr>
-        <w:widowControl/>
         <w:suppressAutoHyphens w:val="true"/>
       </w:pPr>
     </w:pPrDefault>
@@ -2292,7 +6232,10 @@
     <w:qFormat/>
     <w:pPr>
       <w:widowControl/>
+      <w:suppressAutoHyphens w:val="true"/>
       <w:bidi w:val="0"/>
+      <w:spacing w:before="0" w:after="0"/>
+      <w:jc w:val="left"/>
     </w:pPr>
     <w:rPr>
       <w:rFonts w:ascii="Liberation Serif" w:hAnsi="Liberation Serif" w:eastAsia="Noto Serif CJK SC" w:cs="Lohit Devanagari"/>
@@ -2368,5 +6311,15 @@
       <w:rFonts w:cs="Lohit Devanagari"/>
     </w:rPr>
   </w:style>
+  <w:style w:type="paragraph" w:styleId="TableContents">
+    <w:name w:val="Table Contents"/>
+    <w:basedOn w:val="Normal"/>
+    <w:qFormat/>
+    <w:pPr>
+      <w:widowControl w:val="false"/>
+      <w:suppressLineNumbers/>
+    </w:pPr>
+    <w:rPr/>
+  </w:style>
 </w:styles>
 </file>
</xml_diff>